<commit_message>
update icon and cv
</commit_message>
<xml_diff>
--- a/CV/cv_yicheng_zhan.docx
+++ b/CV/cv_yicheng_zhan.docx
@@ -1,6 +1,6 @@
 
 <file path=word/document.xml><?xml version="1.0" encoding="utf-8"?>
-<w:document xmlns:wpc="http://schemas.microsoft.com/office/word/2010/wordprocessingCanvas" xmlns:cx="http://schemas.microsoft.com/office/drawing/2014/chartex" xmlns:cx1="http://schemas.microsoft.com/office/drawing/2015/9/8/chartex" xmlns:cx2="http://schemas.microsoft.com/office/drawing/2015/10/21/chartex" xmlns:cx3="http://schemas.microsoft.com/office/drawing/2016/5/9/chartex" xmlns:cx4="http://schemas.microsoft.com/office/drawing/2016/5/10/chartex" xmlns:cx5="http://schemas.microsoft.com/office/drawing/2016/5/11/chartex" xmlns:cx6="http://schemas.microsoft.com/office/drawing/2016/5/12/chartex" xmlns:cx7="http://schemas.microsoft.com/office/drawing/2016/5/13/chartex" xmlns:cx8="http://schemas.microsoft.com/office/drawing/2016/5/14/chartex" xmlns:mc="http://schemas.openxmlformats.org/markup-compatibility/2006" xmlns:aink="http://schemas.microsoft.com/office/drawing/2016/ink" xmlns:am3d="http://schemas.microsoft.com/office/drawing/2017/model3d" xmlns:o="urn:schemas-microsoft-com:office:office" xmlns:oel="http://schemas.microsoft.com/office/2019/extlst" xmlns:r="http://schemas.openxmlformats.org/officeDocument/2006/relationships" xmlns:m="http://schemas.openxmlformats.org/officeDocument/2006/math" xmlns:v="urn:schemas-microsoft-com:vml" xmlns:wp14="http://schemas.microsoft.com/office/word/2010/wordprocessingDrawing" xmlns:wp="http://schemas.openxmlformats.org/drawingml/2006/wordprocessingDrawing" xmlns:w10="urn:schemas-microsoft-com:office:word" xmlns:w="http://schemas.openxmlformats.org/wordprocessingml/2006/main" xmlns:w14="http://schemas.microsoft.com/office/word/2010/wordml" xmlns:w15="http://schemas.microsoft.com/office/word/2012/wordml" xmlns:w16cex="http://schemas.microsoft.com/office/word/2018/wordml/cex" xmlns:w16cid="http://schemas.microsoft.com/office/word/2016/wordml/cid" xmlns:w16="http://schemas.microsoft.com/office/word/2018/wordml" xmlns:w16du="http://schemas.microsoft.com/office/word/2023/wordml/word16du" xmlns:w16sdtdh="http://schemas.microsoft.com/office/word/2020/wordml/sdtdatahash" xmlns:w16se="http://schemas.microsoft.com/office/word/2015/wordml/symex" xmlns:wpg="http://schemas.microsoft.com/office/word/2010/wordprocessingGroup" xmlns:wpi="http://schemas.microsoft.com/office/word/2010/wordprocessingInk" xmlns:wne="http://schemas.microsoft.com/office/word/2006/wordml" xmlns:wps="http://schemas.microsoft.com/office/word/2010/wordprocessingShape" mc:Ignorable="w14 w15 w16se w16cid w16 w16cex w16sdtdh w16du wp14">
+<w:document xmlns:wpc="http://schemas.microsoft.com/office/word/2010/wordprocessingCanvas" xmlns:cx="http://schemas.microsoft.com/office/drawing/2014/chartex" xmlns:cx1="http://schemas.microsoft.com/office/drawing/2015/9/8/chartex" xmlns:cx2="http://schemas.microsoft.com/office/drawing/2015/10/21/chartex" xmlns:cx3="http://schemas.microsoft.com/office/drawing/2016/5/9/chartex" xmlns:cx4="http://schemas.microsoft.com/office/drawing/2016/5/10/chartex" xmlns:cx5="http://schemas.microsoft.com/office/drawing/2016/5/11/chartex" xmlns:cx6="http://schemas.microsoft.com/office/drawing/2016/5/12/chartex" xmlns:cx7="http://schemas.microsoft.com/office/drawing/2016/5/13/chartex" xmlns:cx8="http://schemas.microsoft.com/office/drawing/2016/5/14/chartex" xmlns:mc="http://schemas.openxmlformats.org/markup-compatibility/2006" xmlns:aink="http://schemas.microsoft.com/office/drawing/2016/ink" xmlns:am3d="http://schemas.microsoft.com/office/drawing/2017/model3d" xmlns:o="urn:schemas-microsoft-com:office:office" xmlns:oel="http://schemas.microsoft.com/office/2019/extlst" xmlns:r="http://schemas.openxmlformats.org/officeDocument/2006/relationships" xmlns:m="http://schemas.openxmlformats.org/officeDocument/2006/math" xmlns:v="urn:schemas-microsoft-com:vml" xmlns:wp14="http://schemas.microsoft.com/office/word/2010/wordprocessingDrawing" xmlns:wp="http://schemas.openxmlformats.org/drawingml/2006/wordprocessingDrawing" xmlns:w10="urn:schemas-microsoft-com:office:word" xmlns:w="http://schemas.openxmlformats.org/wordprocessingml/2006/main" xmlns:w14="http://schemas.microsoft.com/office/word/2010/wordml" xmlns:w15="http://schemas.microsoft.com/office/word/2012/wordml" xmlns:w16cex="http://schemas.microsoft.com/office/word/2018/wordml/cex" xmlns:w16cid="http://schemas.microsoft.com/office/word/2016/wordml/cid" xmlns:w16="http://schemas.microsoft.com/office/word/2018/wordml" xmlns:w16du="http://schemas.microsoft.com/office/word/2023/wordml/word16du" xmlns:w16sdtdh="http://schemas.microsoft.com/office/word/2020/wordml/sdtdatahash" xmlns:w16sdtfl="http://schemas.microsoft.com/office/word/2024/wordml/sdtformatlock" xmlns:w16se="http://schemas.microsoft.com/office/word/2015/wordml/symex" xmlns:wpg="http://schemas.microsoft.com/office/word/2010/wordprocessingGroup" xmlns:wpi="http://schemas.microsoft.com/office/word/2010/wordprocessingInk" xmlns:wne="http://schemas.microsoft.com/office/word/2006/wordml" xmlns:wps="http://schemas.microsoft.com/office/word/2010/wordprocessingShape" mc:Ignorable="w14 w15 w16se w16cid w16 w16cex w16sdtdh w16sdtfl w16du wp14">
   <w:body>
     <w:p>
       <w:pPr>
@@ -146,7 +146,7 @@
         <w:spacing w:before="0" w:beforeAutospacing="0" w:after="0" w:afterAutospacing="0"/>
         <w:ind w:leftChars="-250" w:left="-600" w:rightChars="-250" w:right="-600"/>
         <w:rPr>
-          <w:rFonts w:ascii="Times New Roman" w:hAnsi="Times New Roman" w:cs="Times New Roman" w:hint="eastAsia"/>
+          <w:rFonts w:ascii="Times New Roman" w:hAnsi="Times New Roman" w:cs="Times New Roman"/>
           <w:b/>
           <w:bCs/>
           <w:color w:val="000000"/>
@@ -410,14 +410,36 @@
       </w:r>
       <w:r>
         <w:rPr>
-          <w:rFonts w:ascii="Times New Roman" w:hAnsi="Times New Roman" w:cs="Times New Roman"/>
-          <w:b/>
-          <w:bCs/>
-          <w:color w:val="000000"/>
-          <w:sz w:val="20"/>
-          <w:szCs w:val="20"/>
-        </w:rPr>
-        <w:t>Nov. 2023</w:t>
+          <w:rFonts w:ascii="Times New Roman" w:hAnsi="Times New Roman" w:cs="Times New Roman" w:hint="eastAsia"/>
+          <w:b/>
+          <w:bCs/>
+          <w:color w:val="000000"/>
+          <w:sz w:val="20"/>
+          <w:szCs w:val="20"/>
+        </w:rPr>
+        <w:t>Jan</w:t>
+      </w:r>
+      <w:r>
+        <w:rPr>
+          <w:rFonts w:ascii="Times New Roman" w:hAnsi="Times New Roman" w:cs="Times New Roman"/>
+          <w:b/>
+          <w:bCs/>
+          <w:color w:val="000000"/>
+          <w:sz w:val="20"/>
+          <w:szCs w:val="20"/>
+        </w:rPr>
+        <w:t>. 202</w:t>
+      </w:r>
+      <w:r>
+        <w:rPr>
+          <w:rFonts w:ascii="Times New Roman" w:hAnsi="Times New Roman" w:cs="Times New Roman" w:hint="eastAsia"/>
+          <w:b/>
+          <w:bCs/>
+          <w:color w:val="000000"/>
+          <w:sz w:val="20"/>
+          <w:szCs w:val="20"/>
+        </w:rPr>
+        <w:t>4</w:t>
       </w:r>
       <w:r>
         <w:rPr>
@@ -1591,7 +1613,7 @@
         <w:ind w:leftChars="-250" w:left="-240" w:rightChars="-250" w:right="-600"/>
         <w:textAlignment w:val="baseline"/>
         <w:rPr>
-          <w:rFonts w:ascii="Times New Roman" w:hAnsi="Times New Roman" w:cs="Times New Roman" w:hint="eastAsia"/>
+          <w:rFonts w:ascii="Times New Roman" w:hAnsi="Times New Roman" w:cs="Times New Roman"/>
           <w:color w:val="000000"/>
           <w:sz w:val="20"/>
           <w:szCs w:val="20"/>
@@ -2321,7 +2343,7 @@
         <w:textAlignment w:val="baseline"/>
         <w:rPr>
           <w:rStyle w:val="None"/>
-          <w:rFonts w:ascii="Times New Roman" w:hAnsi="Times New Roman" w:cs="Times New Roman" w:hint="eastAsia"/>
+          <w:rFonts w:ascii="Times New Roman" w:hAnsi="Times New Roman" w:cs="Times New Roman"/>
           <w:color w:val="000000"/>
           <w:sz w:val="22"/>
           <w:szCs w:val="22"/>
@@ -2498,25 +2520,114 @@
       </w:pPr>
       <w:r>
         <w:rPr>
-          <w:rFonts w:ascii="Times New Roman" w:hAnsi="Times New Roman" w:cs="Times New Roman"/>
-          <w:b/>
-          <w:bCs/>
-          <w:color w:val="000000"/>
-          <w:sz w:val="20"/>
-          <w:szCs w:val="20"/>
-        </w:rPr>
-        <w:t>Machine learning</w:t>
-      </w:r>
-      <w:r>
-        <w:rPr>
-          <w:rFonts w:ascii="Times New Roman" w:hAnsi="Times New Roman" w:cs="Times New Roman"/>
-          <w:b/>
-          <w:bCs/>
-          <w:color w:val="000000"/>
-          <w:sz w:val="20"/>
-          <w:szCs w:val="20"/>
-        </w:rPr>
-        <w:t xml:space="preserve"> and Data Analyzation</w:t>
+          <w:rFonts w:ascii="Times New Roman" w:hAnsi="Times New Roman" w:cs="Times New Roman" w:hint="eastAsia"/>
+          <w:b/>
+          <w:bCs/>
+          <w:color w:val="000000"/>
+          <w:sz w:val="20"/>
+          <w:szCs w:val="20"/>
+        </w:rPr>
+        <w:t xml:space="preserve">Neural Representation </w:t>
+      </w:r>
+      <w:r>
+        <w:rPr>
+          <w:rFonts w:ascii="Times New Roman" w:hAnsi="Times New Roman" w:cs="Times New Roman"/>
+          <w:b/>
+          <w:bCs/>
+          <w:color w:val="000000"/>
+          <w:sz w:val="20"/>
+          <w:szCs w:val="20"/>
+        </w:rPr>
+        <w:t xml:space="preserve">| Research </w:t>
+      </w:r>
+      <w:r>
+        <w:rPr>
+          <w:rFonts w:ascii="Times New Roman" w:hAnsi="Times New Roman" w:cs="Times New Roman" w:hint="eastAsia"/>
+          <w:b/>
+          <w:bCs/>
+          <w:color w:val="000000"/>
+          <w:sz w:val="20"/>
+          <w:szCs w:val="20"/>
+        </w:rPr>
+        <w:t>Intern</w:t>
+      </w:r>
+      <w:r>
+        <w:rPr>
+          <w:rFonts w:ascii="Times New Roman" w:hAnsi="Times New Roman" w:cs="Times New Roman"/>
+          <w:b/>
+          <w:bCs/>
+          <w:color w:val="000000"/>
+          <w:sz w:val="20"/>
+          <w:szCs w:val="20"/>
+        </w:rPr>
+        <w:tab/>
+      </w:r>
+      <w:r>
+        <w:rPr>
+          <w:rFonts w:ascii="Times New Roman" w:hAnsi="Times New Roman" w:cs="Times New Roman"/>
+          <w:b/>
+          <w:bCs/>
+          <w:color w:val="000000"/>
+          <w:sz w:val="20"/>
+          <w:szCs w:val="20"/>
+        </w:rPr>
+        <w:tab/>
+      </w:r>
+      <w:r>
+        <w:rPr>
+          <w:rFonts w:ascii="Times New Roman" w:hAnsi="Times New Roman" w:cs="Times New Roman"/>
+          <w:b/>
+          <w:bCs/>
+          <w:color w:val="000000"/>
+          <w:sz w:val="20"/>
+          <w:szCs w:val="20"/>
+        </w:rPr>
+        <w:tab/>
+      </w:r>
+      <w:r>
+        <w:rPr>
+          <w:rFonts w:ascii="Times New Roman" w:hAnsi="Times New Roman" w:cs="Times New Roman"/>
+          <w:b/>
+          <w:bCs/>
+          <w:color w:val="000000"/>
+          <w:sz w:val="20"/>
+          <w:szCs w:val="20"/>
+        </w:rPr>
+        <w:tab/>
+      </w:r>
+      <w:r>
+        <w:rPr>
+          <w:rFonts w:ascii="Times New Roman" w:hAnsi="Times New Roman" w:cs="Times New Roman"/>
+          <w:b/>
+          <w:bCs/>
+          <w:color w:val="000000"/>
+          <w:sz w:val="20"/>
+          <w:szCs w:val="20"/>
+        </w:rPr>
+        <w:tab/>
+      </w:r>
+      <w:r>
+        <w:rPr>
+          <w:rFonts w:ascii="Times New Roman" w:hAnsi="Times New Roman" w:cs="Times New Roman"/>
+          <w:b/>
+          <w:bCs/>
+          <w:color w:val="000000"/>
+          <w:sz w:val="20"/>
+          <w:szCs w:val="20"/>
+        </w:rPr>
+        <w:tab/>
+        <w:t xml:space="preserve">          </w:t>
+      </w:r>
+      <w:r>
+        <w:rPr>
+          <w:rFonts w:ascii="Times New Roman" w:hAnsi="Times New Roman" w:cs="Times New Roman" w:hint="eastAsia"/>
+          <w:b/>
+          <w:bCs/>
+          <w:color w:val="000000"/>
+          <w:sz w:val="20"/>
+          <w:szCs w:val="20"/>
+        </w:rPr>
+        <w:t xml:space="preserve">          </w:t>
       </w:r>
       <w:r>
         <w:rPr>
@@ -2531,107 +2642,7 @@
       </w:r>
       <w:r>
         <w:rPr>
-          <w:rFonts w:ascii="Times New Roman" w:hAnsi="Times New Roman" w:cs="Times New Roman"/>
-          <w:b/>
-          <w:bCs/>
-          <w:color w:val="000000"/>
-          <w:sz w:val="20"/>
-          <w:szCs w:val="20"/>
-        </w:rPr>
-        <w:t>| Research Assistant</w:t>
-      </w:r>
-      <w:r>
-        <w:rPr>
-          <w:rFonts w:ascii="Times New Roman" w:hAnsi="Times New Roman" w:cs="Times New Roman"/>
-          <w:b/>
-          <w:bCs/>
-          <w:color w:val="000000"/>
-          <w:sz w:val="20"/>
-          <w:szCs w:val="20"/>
-        </w:rPr>
-        <w:tab/>
-      </w:r>
-      <w:r>
-        <w:rPr>
-          <w:rFonts w:ascii="Times New Roman" w:hAnsi="Times New Roman" w:cs="Times New Roman"/>
-          <w:b/>
-          <w:bCs/>
-          <w:color w:val="000000"/>
-          <w:sz w:val="20"/>
-          <w:szCs w:val="20"/>
-        </w:rPr>
-        <w:tab/>
-      </w:r>
-      <w:r>
-        <w:rPr>
-          <w:rFonts w:ascii="Times New Roman" w:hAnsi="Times New Roman" w:cs="Times New Roman"/>
-          <w:b/>
-          <w:bCs/>
-          <w:color w:val="000000"/>
-          <w:sz w:val="20"/>
-          <w:szCs w:val="20"/>
-        </w:rPr>
-        <w:tab/>
-      </w:r>
-      <w:r>
-        <w:rPr>
-          <w:rFonts w:ascii="Times New Roman" w:hAnsi="Times New Roman" w:cs="Times New Roman"/>
-          <w:b/>
-          <w:bCs/>
-          <w:color w:val="000000"/>
-          <w:sz w:val="20"/>
-          <w:szCs w:val="20"/>
-        </w:rPr>
-        <w:tab/>
-      </w:r>
-      <w:r>
-        <w:rPr>
-          <w:rFonts w:ascii="Times New Roman" w:hAnsi="Times New Roman" w:cs="Times New Roman"/>
-          <w:b/>
-          <w:bCs/>
-          <w:color w:val="000000"/>
-          <w:sz w:val="20"/>
-          <w:szCs w:val="20"/>
-        </w:rPr>
-        <w:tab/>
-      </w:r>
-      <w:r>
-        <w:rPr>
-          <w:rFonts w:ascii="Times New Roman" w:hAnsi="Times New Roman" w:cs="Times New Roman"/>
-          <w:b/>
-          <w:bCs/>
-          <w:color w:val="000000"/>
-          <w:sz w:val="20"/>
-          <w:szCs w:val="20"/>
-        </w:rPr>
-        <w:tab/>
-        <w:t xml:space="preserve">       </w:t>
-      </w:r>
-      <w:r>
-        <w:rPr>
-          <w:rFonts w:ascii="Times New Roman" w:hAnsi="Times New Roman" w:cs="Times New Roman"/>
-          <w:b/>
-          <w:bCs/>
-          <w:color w:val="000000"/>
-          <w:sz w:val="20"/>
-          <w:szCs w:val="20"/>
-        </w:rPr>
-        <w:t xml:space="preserve">   </w:t>
-      </w:r>
-      <w:r>
-        <w:rPr>
-          <w:rFonts w:ascii="Times New Roman" w:hAnsi="Times New Roman" w:cs="Times New Roman" w:hint="eastAsia"/>
-          <w:b/>
-          <w:bCs/>
-          <w:color w:val="000000"/>
-          <w:sz w:val="20"/>
-          <w:szCs w:val="20"/>
-        </w:rPr>
-        <w:t xml:space="preserve">          </w:t>
-      </w:r>
-      <w:r>
-        <w:rPr>
-          <w:rFonts w:ascii="Times New Roman" w:hAnsi="Times New Roman" w:cs="Times New Roman"/>
+          <w:rFonts w:ascii="Times New Roman" w:hAnsi="Times New Roman" w:cs="Times New Roman" w:hint="eastAsia"/>
           <w:b/>
           <w:bCs/>
           <w:color w:val="000000"/>
@@ -2649,6 +2660,39 @@
           <w:sz w:val="20"/>
           <w:szCs w:val="20"/>
         </w:rPr>
+        <w:t xml:space="preserve">                 </w:t>
+      </w:r>
+      <w:r>
+        <w:rPr>
+          <w:rFonts w:ascii="Times New Roman" w:hAnsi="Times New Roman" w:cs="Times New Roman" w:hint="eastAsia"/>
+          <w:b/>
+          <w:bCs/>
+          <w:color w:val="000000"/>
+          <w:sz w:val="20"/>
+          <w:szCs w:val="20"/>
+        </w:rPr>
+        <w:t>Mar</w:t>
+      </w:r>
+      <w:r>
+        <w:rPr>
+          <w:rFonts w:ascii="Times New Roman" w:hAnsi="Times New Roman" w:cs="Times New Roman"/>
+          <w:b/>
+          <w:bCs/>
+          <w:color w:val="000000"/>
+          <w:sz w:val="20"/>
+          <w:szCs w:val="20"/>
+        </w:rPr>
+        <w:t>.</w:t>
+      </w:r>
+      <w:r>
+        <w:rPr>
+          <w:rFonts w:ascii="Times New Roman" w:hAnsi="Times New Roman" w:cs="Times New Roman" w:hint="eastAsia"/>
+          <w:b/>
+          <w:bCs/>
+          <w:color w:val="000000"/>
+          <w:sz w:val="20"/>
+          <w:szCs w:val="20"/>
+        </w:rPr>
         <w:t xml:space="preserve"> </w:t>
       </w:r>
       <w:r>
@@ -2660,29 +2704,29 @@
           <w:sz w:val="20"/>
           <w:szCs w:val="20"/>
         </w:rPr>
-        <w:t>July</w:t>
-      </w:r>
-      <w:r>
-        <w:rPr>
-          <w:rFonts w:ascii="Times New Roman" w:hAnsi="Times New Roman" w:cs="Times New Roman"/>
-          <w:b/>
-          <w:bCs/>
-          <w:color w:val="000000"/>
-          <w:sz w:val="20"/>
-          <w:szCs w:val="20"/>
-        </w:rPr>
-        <w:t xml:space="preserve">.2023- </w:t>
-      </w:r>
-      <w:r>
-        <w:rPr>
-          <w:rFonts w:ascii="Times New Roman" w:hAnsi="Times New Roman" w:cs="Times New Roman"/>
-          <w:b/>
-          <w:bCs/>
-          <w:color w:val="000000"/>
-          <w:sz w:val="20"/>
-          <w:szCs w:val="20"/>
-        </w:rPr>
-        <w:t>Now</w:t>
+        <w:t>202</w:t>
+      </w:r>
+      <w:r>
+        <w:rPr>
+          <w:rFonts w:ascii="Times New Roman" w:hAnsi="Times New Roman" w:cs="Times New Roman" w:hint="eastAsia"/>
+          <w:b/>
+          <w:bCs/>
+          <w:color w:val="000000"/>
+          <w:sz w:val="20"/>
+          <w:szCs w:val="20"/>
+        </w:rPr>
+        <w:t>5</w:t>
+      </w:r>
+      <w:r>
+        <w:rPr>
+          <w:rFonts w:ascii="Times New Roman" w:hAnsi="Times New Roman" w:cs="Times New Roman"/>
+          <w:b/>
+          <w:bCs/>
+          <w:color w:val="000000"/>
+          <w:sz w:val="20"/>
+          <w:szCs w:val="20"/>
+        </w:rPr>
+        <w:t>- Now</w:t>
       </w:r>
     </w:p>
     <w:p>
@@ -2708,183 +2752,7 @@
           <w:sz w:val="20"/>
           <w:szCs w:val="20"/>
         </w:rPr>
-        <w:t>Imperial College London</w:t>
-      </w:r>
-      <w:r>
-        <w:rPr>
-          <w:rFonts w:ascii="Times New Roman" w:hAnsi="Times New Roman" w:cs="Times New Roman"/>
-          <w:b/>
-          <w:bCs/>
-          <w:color w:val="000000"/>
-          <w:sz w:val="20"/>
-          <w:szCs w:val="20"/>
-        </w:rPr>
-        <w:tab/>
-      </w:r>
-      <w:r>
-        <w:rPr>
-          <w:rFonts w:ascii="Times New Roman" w:hAnsi="Times New Roman" w:cs="Times New Roman"/>
-          <w:b/>
-          <w:bCs/>
-          <w:color w:val="000000"/>
-          <w:sz w:val="20"/>
-          <w:szCs w:val="20"/>
-        </w:rPr>
-        <w:tab/>
-      </w:r>
-      <w:r>
-        <w:rPr>
-          <w:rFonts w:ascii="Times New Roman" w:hAnsi="Times New Roman" w:cs="Times New Roman"/>
-          <w:b/>
-          <w:bCs/>
-          <w:color w:val="000000"/>
-          <w:sz w:val="20"/>
-          <w:szCs w:val="20"/>
-        </w:rPr>
-        <w:tab/>
-      </w:r>
-      <w:r>
-        <w:rPr>
-          <w:rFonts w:ascii="Times New Roman" w:hAnsi="Times New Roman" w:cs="Times New Roman"/>
-          <w:b/>
-          <w:bCs/>
-          <w:color w:val="000000"/>
-          <w:sz w:val="20"/>
-          <w:szCs w:val="20"/>
-        </w:rPr>
-        <w:tab/>
-      </w:r>
-      <w:r>
-        <w:rPr>
-          <w:rFonts w:ascii="Times New Roman" w:hAnsi="Times New Roman" w:cs="Times New Roman"/>
-          <w:b/>
-          <w:bCs/>
-          <w:color w:val="000000"/>
-          <w:sz w:val="20"/>
-          <w:szCs w:val="20"/>
-        </w:rPr>
-        <w:tab/>
-      </w:r>
-      <w:r>
-        <w:rPr>
-          <w:rFonts w:ascii="Times New Roman" w:hAnsi="Times New Roman" w:cs="Times New Roman"/>
-          <w:b/>
-          <w:bCs/>
-          <w:color w:val="000000"/>
-          <w:sz w:val="20"/>
-          <w:szCs w:val="20"/>
-        </w:rPr>
-        <w:tab/>
-      </w:r>
-      <w:r>
-        <w:rPr>
-          <w:rFonts w:ascii="Times New Roman" w:hAnsi="Times New Roman" w:cs="Times New Roman"/>
-          <w:b/>
-          <w:bCs/>
-          <w:color w:val="000000"/>
-          <w:sz w:val="20"/>
-          <w:szCs w:val="20"/>
-        </w:rPr>
-        <w:tab/>
-      </w:r>
-      <w:r>
-        <w:rPr>
-          <w:rFonts w:ascii="Times New Roman" w:hAnsi="Times New Roman" w:cs="Times New Roman"/>
-          <w:b/>
-          <w:bCs/>
-          <w:color w:val="000000"/>
-          <w:sz w:val="20"/>
-          <w:szCs w:val="20"/>
-        </w:rPr>
-        <w:tab/>
-      </w:r>
-      <w:r>
-        <w:rPr>
-          <w:rFonts w:ascii="Times New Roman" w:hAnsi="Times New Roman" w:cs="Times New Roman"/>
-          <w:b/>
-          <w:bCs/>
-          <w:color w:val="000000"/>
-          <w:sz w:val="20"/>
-          <w:szCs w:val="20"/>
-        </w:rPr>
-        <w:tab/>
-      </w:r>
-      <w:r>
-        <w:rPr>
-          <w:rFonts w:ascii="Times New Roman" w:hAnsi="Times New Roman" w:cs="Times New Roman"/>
-          <w:b/>
-          <w:bCs/>
-          <w:color w:val="000000"/>
-          <w:sz w:val="20"/>
-          <w:szCs w:val="20"/>
-        </w:rPr>
-        <w:tab/>
-      </w:r>
-      <w:r>
-        <w:rPr>
-          <w:rFonts w:ascii="Times New Roman" w:hAnsi="Times New Roman" w:cs="Times New Roman"/>
-          <w:b/>
-          <w:bCs/>
-          <w:color w:val="000000"/>
-          <w:sz w:val="20"/>
-          <w:szCs w:val="20"/>
-        </w:rPr>
-        <w:tab/>
-      </w:r>
-      <w:r>
-        <w:rPr>
-          <w:rFonts w:ascii="Times New Roman" w:hAnsi="Times New Roman" w:cs="Times New Roman"/>
-          <w:b/>
-          <w:bCs/>
-          <w:color w:val="000000"/>
-          <w:sz w:val="20"/>
-          <w:szCs w:val="20"/>
-        </w:rPr>
-        <w:tab/>
-      </w:r>
-      <w:r>
-        <w:rPr>
-          <w:rFonts w:ascii="Times New Roman" w:hAnsi="Times New Roman" w:cs="Times New Roman"/>
-          <w:b/>
-          <w:bCs/>
-          <w:color w:val="000000"/>
-          <w:sz w:val="20"/>
-          <w:szCs w:val="20"/>
-        </w:rPr>
-        <w:tab/>
-      </w:r>
-      <w:r>
-        <w:rPr>
-          <w:rFonts w:ascii="Times New Roman" w:hAnsi="Times New Roman" w:cs="Times New Roman"/>
-          <w:b/>
-          <w:bCs/>
-          <w:color w:val="000000"/>
-          <w:sz w:val="20"/>
-          <w:szCs w:val="20"/>
-        </w:rPr>
-        <w:tab/>
-      </w:r>
-      <w:r>
-        <w:rPr>
-          <w:rFonts w:ascii="Times New Roman" w:hAnsi="Times New Roman" w:cs="Times New Roman"/>
-          <w:b/>
-          <w:bCs/>
-          <w:color w:val="000000"/>
-          <w:sz w:val="20"/>
-          <w:szCs w:val="20"/>
-        </w:rPr>
-        <w:tab/>
-      </w:r>
-      <w:r>
-        <w:rPr>
-          <w:rFonts w:ascii="Times New Roman" w:hAnsi="Times New Roman" w:cs="Times New Roman"/>
-          <w:b/>
-          <w:bCs/>
-          <w:color w:val="000000"/>
-          <w:sz w:val="20"/>
-          <w:szCs w:val="20"/>
-        </w:rPr>
-        <w:tab/>
+        <w:t>Huawei Technologies Research &amp; Development Ltd</w:t>
       </w:r>
       <w:r>
         <w:rPr>
@@ -2896,6 +2764,128 @@
           <w:szCs w:val="20"/>
         </w:rPr>
         <w:t xml:space="preserve"> </w:t>
+      </w:r>
+      <w:r>
+        <w:rPr>
+          <w:rFonts w:ascii="Times New Roman" w:hAnsi="Times New Roman" w:cs="Times New Roman" w:hint="eastAsia"/>
+          <w:color w:val="000000"/>
+          <w:sz w:val="20"/>
+          <w:szCs w:val="20"/>
+        </w:rPr>
+        <w:t>(</w:t>
+      </w:r>
+      <w:r>
+        <w:rPr>
+          <w:rFonts w:ascii="Times New Roman" w:hAnsi="Times New Roman" w:cs="Times New Roman"/>
+          <w:b/>
+          <w:bCs/>
+          <w:color w:val="000000"/>
+          <w:sz w:val="20"/>
+          <w:szCs w:val="20"/>
+        </w:rPr>
+        <w:t>Supervisor</w:t>
+      </w:r>
+      <w:r>
+        <w:rPr>
+          <w:rFonts w:ascii="Times New Roman" w:hAnsi="Times New Roman" w:cs="Times New Roman"/>
+          <w:color w:val="000000"/>
+          <w:sz w:val="20"/>
+          <w:szCs w:val="20"/>
+        </w:rPr>
+        <w:t xml:space="preserve">: </w:t>
+      </w:r>
+      <w:r>
+        <w:rPr>
+          <w:rFonts w:ascii="Times New Roman" w:hAnsi="Times New Roman" w:cs="Times New Roman"/>
+          <w:color w:val="000000"/>
+          <w:sz w:val="20"/>
+          <w:szCs w:val="20"/>
+        </w:rPr>
+        <w:t xml:space="preserve">Dr. </w:t>
+      </w:r>
+      <w:proofErr w:type="spellStart"/>
+      <w:r>
+        <w:rPr>
+          <w:rFonts w:ascii="Times New Roman" w:hAnsi="Times New Roman" w:cs="Times New Roman"/>
+          <w:color w:val="000000"/>
+          <w:sz w:val="20"/>
+          <w:szCs w:val="20"/>
+        </w:rPr>
+        <w:t>Songcen</w:t>
+      </w:r>
+      <w:proofErr w:type="spellEnd"/>
+      <w:r>
+        <w:rPr>
+          <w:rFonts w:ascii="Times New Roman" w:hAnsi="Times New Roman" w:cs="Times New Roman"/>
+          <w:color w:val="000000"/>
+          <w:sz w:val="20"/>
+          <w:szCs w:val="20"/>
+        </w:rPr>
+        <w:t xml:space="preserve"> Xu</w:t>
+      </w:r>
+      <w:r>
+        <w:rPr>
+          <w:rFonts w:ascii="Times New Roman" w:hAnsi="Times New Roman" w:cs="Times New Roman" w:hint="eastAsia"/>
+          <w:color w:val="000000"/>
+          <w:sz w:val="20"/>
+          <w:szCs w:val="20"/>
+        </w:rPr>
+        <w:t>)</w:t>
+      </w:r>
+      <w:r>
+        <w:rPr>
+          <w:rFonts w:ascii="Times New Roman" w:hAnsi="Times New Roman" w:cs="Times New Roman"/>
+          <w:b/>
+          <w:bCs/>
+          <w:color w:val="000000"/>
+          <w:sz w:val="20"/>
+          <w:szCs w:val="20"/>
+        </w:rPr>
+        <w:tab/>
+      </w:r>
+      <w:r>
+        <w:rPr>
+          <w:rFonts w:ascii="Times New Roman" w:hAnsi="Times New Roman" w:cs="Times New Roman" w:hint="eastAsia"/>
+          <w:b/>
+          <w:bCs/>
+          <w:color w:val="000000"/>
+          <w:sz w:val="20"/>
+          <w:szCs w:val="20"/>
+        </w:rPr>
+        <w:t xml:space="preserve">       </w:t>
+      </w:r>
+      <w:r>
+        <w:rPr>
+          <w:rFonts w:ascii="Times New Roman" w:hAnsi="Times New Roman" w:cs="Times New Roman" w:hint="eastAsia"/>
+          <w:b/>
+          <w:bCs/>
+          <w:color w:val="000000"/>
+          <w:sz w:val="20"/>
+          <w:szCs w:val="20"/>
+        </w:rPr>
+        <w:t xml:space="preserve">    </w:t>
+      </w:r>
+      <w:r>
+        <w:rPr>
+          <w:rFonts w:ascii="Times New Roman" w:hAnsi="Times New Roman" w:cs="Times New Roman" w:hint="eastAsia"/>
+          <w:b/>
+          <w:bCs/>
+          <w:color w:val="000000"/>
+          <w:sz w:val="20"/>
+          <w:szCs w:val="20"/>
+        </w:rPr>
+        <w:t xml:space="preserve"> </w:t>
+      </w:r>
+      <w:r>
+        <w:rPr>
+          <w:rFonts w:ascii="Times New Roman" w:hAnsi="Times New Roman" w:cs="Times New Roman" w:hint="eastAsia"/>
+          <w:b/>
+          <w:bCs/>
+          <w:color w:val="000000"/>
+          <w:sz w:val="20"/>
+          <w:szCs w:val="20"/>
+        </w:rPr>
+        <w:t xml:space="preserve">  </w:t>
       </w:r>
       <w:r>
         <w:rPr>
@@ -2953,33 +2943,55 @@
         <w:ind w:leftChars="-250" w:left="-240" w:rightChars="-250" w:right="-600"/>
         <w:textAlignment w:val="baseline"/>
         <w:rPr>
-          <w:rFonts w:ascii="Times New Roman" w:hAnsi="Times New Roman" w:cs="Times New Roman" w:hint="eastAsia"/>
-          <w:color w:val="000000"/>
-          <w:sz w:val="20"/>
-          <w:szCs w:val="20"/>
-        </w:rPr>
-      </w:pPr>
-      <w:r>
-        <w:rPr>
-          <w:rFonts w:ascii="Times New Roman" w:hAnsi="Times New Roman" w:cs="Times New Roman"/>
-          <w:color w:val="000000"/>
-          <w:sz w:val="20"/>
-          <w:szCs w:val="20"/>
-        </w:rPr>
-        <w:t>D</w:t>
-      </w:r>
-      <w:r>
-        <w:rPr>
-          <w:rFonts w:ascii="Times New Roman" w:hAnsi="Times New Roman" w:cs="Times New Roman"/>
-          <w:color w:val="000000"/>
-          <w:sz w:val="20"/>
-          <w:szCs w:val="20"/>
-        </w:rPr>
-        <w:t>esigned advanced machine learning networks to enhance efficiency and accuracy in crime linkage analysis.</w:t>
-      </w:r>
-      <w:r>
-        <w:rPr>
-          <w:rFonts w:ascii="Times New Roman" w:hAnsi="Times New Roman" w:cs="Times New Roman" w:hint="eastAsia"/>
+          <w:rFonts w:ascii="Times New Roman" w:hAnsi="Times New Roman" w:cs="Times New Roman"/>
+          <w:b/>
+          <w:bCs/>
+          <w:color w:val="000000"/>
+          <w:sz w:val="20"/>
+          <w:szCs w:val="20"/>
+        </w:rPr>
+      </w:pPr>
+      <w:r>
+        <w:rPr>
+          <w:rFonts w:ascii="Times New Roman" w:hAnsi="Times New Roman" w:cs="Times New Roman" w:hint="eastAsia"/>
+          <w:color w:val="000000"/>
+          <w:sz w:val="20"/>
+          <w:szCs w:val="20"/>
+        </w:rPr>
+        <w:t>Conduct research on 3D Gaussian Splatting.</w:t>
+      </w:r>
+    </w:p>
+    <w:p>
+      <w:pPr>
+        <w:pStyle w:val="ad"/>
+        <w:spacing w:before="0" w:beforeAutospacing="0" w:after="0" w:afterAutospacing="0"/>
+        <w:ind w:left="-600" w:rightChars="-250" w:right="-600"/>
+        <w:textAlignment w:val="baseline"/>
+        <w:rPr>
+          <w:rFonts w:ascii="Times New Roman" w:hAnsi="Times New Roman" w:cs="Times New Roman" w:hint="eastAsia"/>
+          <w:b/>
+          <w:bCs/>
+          <w:color w:val="000000"/>
+          <w:sz w:val="20"/>
+          <w:szCs w:val="20"/>
+        </w:rPr>
+      </w:pPr>
+      <w:r>
+        <w:rPr>
+          <w:rFonts w:ascii="Times New Roman" w:hAnsi="Times New Roman" w:cs="Times New Roman" w:hint="eastAsia"/>
+          <w:b/>
+          <w:bCs/>
+          <w:color w:val="000000"/>
+          <w:sz w:val="20"/>
+          <w:szCs w:val="20"/>
+        </w:rPr>
+        <w:t>Crime Linkage Analysis</w:t>
+      </w:r>
+      <w:r>
+        <w:rPr>
+          <w:rFonts w:ascii="Times New Roman" w:hAnsi="Times New Roman" w:cs="Times New Roman"/>
+          <w:b/>
+          <w:bCs/>
           <w:color w:val="000000"/>
           <w:sz w:val="20"/>
           <w:szCs w:val="20"/>
@@ -2989,78 +3001,179 @@
       <w:r>
         <w:rPr>
           <w:rFonts w:ascii="Times New Roman" w:hAnsi="Times New Roman" w:cs="Times New Roman"/>
-          <w:color w:val="000000"/>
-          <w:sz w:val="20"/>
-          <w:szCs w:val="20"/>
-        </w:rPr>
-        <w:t>Employed Siamese Autoencoder for dimensionality reduction and pattern recognition in behavioral data, aiding in identifying serial offenders and supporting victim credibility.</w:t>
-      </w:r>
-      <w:r>
-        <w:rPr>
-          <w:rFonts w:ascii="Times New Roman" w:hAnsi="Times New Roman" w:cs="Times New Roman" w:hint="eastAsia"/>
-          <w:color w:val="000000"/>
-          <w:sz w:val="20"/>
-          <w:szCs w:val="20"/>
-        </w:rPr>
-        <w:t xml:space="preserve"> (</w:t>
-      </w:r>
-      <w:r>
-        <w:rPr>
-          <w:rFonts w:ascii="Times New Roman" w:hAnsi="Times New Roman" w:cs="Times New Roman"/>
-          <w:b/>
-          <w:bCs/>
-          <w:color w:val="000000"/>
-          <w:sz w:val="20"/>
-          <w:szCs w:val="20"/>
-        </w:rPr>
-        <w:t>Supervisor</w:t>
-      </w:r>
-      <w:r>
-        <w:rPr>
-          <w:rFonts w:ascii="Times New Roman" w:hAnsi="Times New Roman" w:cs="Times New Roman"/>
-          <w:color w:val="000000"/>
-          <w:sz w:val="20"/>
-          <w:szCs w:val="20"/>
-        </w:rPr>
-        <w:t xml:space="preserve">: </w:t>
-      </w:r>
-      <w:r>
-        <w:rPr>
-          <w:rFonts w:ascii="Times New Roman" w:hAnsi="Times New Roman" w:cs="Times New Roman" w:hint="eastAsia"/>
-          <w:color w:val="000000"/>
-          <w:sz w:val="20"/>
-          <w:szCs w:val="20"/>
-        </w:rPr>
-        <w:t xml:space="preserve">Assoc. </w:t>
-      </w:r>
-      <w:r>
-        <w:rPr>
-          <w:rFonts w:ascii="Times New Roman" w:hAnsi="Times New Roman" w:cs="Times New Roman"/>
-          <w:color w:val="000000"/>
-          <w:sz w:val="20"/>
-          <w:szCs w:val="20"/>
-        </w:rPr>
-        <w:t xml:space="preserve">Prof. Dalal </w:t>
-      </w:r>
-      <w:proofErr w:type="spellStart"/>
-      <w:r>
-        <w:rPr>
-          <w:rFonts w:ascii="Times New Roman" w:hAnsi="Times New Roman" w:cs="Times New Roman"/>
-          <w:color w:val="000000"/>
-          <w:sz w:val="20"/>
-          <w:szCs w:val="20"/>
-        </w:rPr>
-        <w:t>Alrajeh</w:t>
-      </w:r>
-      <w:proofErr w:type="spellEnd"/>
-      <w:r>
-        <w:rPr>
-          <w:rFonts w:ascii="Times New Roman" w:hAnsi="Times New Roman" w:cs="Times New Roman" w:hint="eastAsia"/>
-          <w:color w:val="000000"/>
-          <w:sz w:val="20"/>
-          <w:szCs w:val="20"/>
-        </w:rPr>
-        <w:t>)</w:t>
+          <w:b/>
+          <w:bCs/>
+          <w:color w:val="000000"/>
+          <w:sz w:val="20"/>
+          <w:szCs w:val="20"/>
+        </w:rPr>
+        <w:t>| Research Assistant</w:t>
+      </w:r>
+      <w:r>
+        <w:rPr>
+          <w:rFonts w:ascii="Times New Roman" w:hAnsi="Times New Roman" w:cs="Times New Roman"/>
+          <w:b/>
+          <w:bCs/>
+          <w:color w:val="000000"/>
+          <w:sz w:val="20"/>
+          <w:szCs w:val="20"/>
+        </w:rPr>
+        <w:tab/>
+      </w:r>
+      <w:r>
+        <w:rPr>
+          <w:rFonts w:ascii="Times New Roman" w:hAnsi="Times New Roman" w:cs="Times New Roman"/>
+          <w:b/>
+          <w:bCs/>
+          <w:color w:val="000000"/>
+          <w:sz w:val="20"/>
+          <w:szCs w:val="20"/>
+        </w:rPr>
+        <w:tab/>
+      </w:r>
+      <w:r>
+        <w:rPr>
+          <w:rFonts w:ascii="Times New Roman" w:hAnsi="Times New Roman" w:cs="Times New Roman"/>
+          <w:b/>
+          <w:bCs/>
+          <w:color w:val="000000"/>
+          <w:sz w:val="20"/>
+          <w:szCs w:val="20"/>
+        </w:rPr>
+        <w:tab/>
+      </w:r>
+      <w:r>
+        <w:rPr>
+          <w:rFonts w:ascii="Times New Roman" w:hAnsi="Times New Roman" w:cs="Times New Roman"/>
+          <w:b/>
+          <w:bCs/>
+          <w:color w:val="000000"/>
+          <w:sz w:val="20"/>
+          <w:szCs w:val="20"/>
+        </w:rPr>
+        <w:tab/>
+      </w:r>
+      <w:r>
+        <w:rPr>
+          <w:rFonts w:ascii="Times New Roman" w:hAnsi="Times New Roman" w:cs="Times New Roman"/>
+          <w:b/>
+          <w:bCs/>
+          <w:color w:val="000000"/>
+          <w:sz w:val="20"/>
+          <w:szCs w:val="20"/>
+        </w:rPr>
+        <w:tab/>
+      </w:r>
+      <w:r>
+        <w:rPr>
+          <w:rFonts w:ascii="Times New Roman" w:hAnsi="Times New Roman" w:cs="Times New Roman"/>
+          <w:b/>
+          <w:bCs/>
+          <w:color w:val="000000"/>
+          <w:sz w:val="20"/>
+          <w:szCs w:val="20"/>
+        </w:rPr>
+        <w:tab/>
+        <w:t xml:space="preserve">       </w:t>
+      </w:r>
+      <w:r>
+        <w:rPr>
+          <w:rFonts w:ascii="Times New Roman" w:hAnsi="Times New Roman" w:cs="Times New Roman"/>
+          <w:b/>
+          <w:bCs/>
+          <w:color w:val="000000"/>
+          <w:sz w:val="20"/>
+          <w:szCs w:val="20"/>
+        </w:rPr>
+        <w:t xml:space="preserve">   </w:t>
+      </w:r>
+      <w:r>
+        <w:rPr>
+          <w:rFonts w:ascii="Times New Roman" w:hAnsi="Times New Roman" w:cs="Times New Roman" w:hint="eastAsia"/>
+          <w:b/>
+          <w:bCs/>
+          <w:color w:val="000000"/>
+          <w:sz w:val="20"/>
+          <w:szCs w:val="20"/>
+        </w:rPr>
+        <w:t xml:space="preserve">       </w:t>
+      </w:r>
+      <w:r>
+        <w:rPr>
+          <w:rFonts w:ascii="Times New Roman" w:hAnsi="Times New Roman" w:cs="Times New Roman" w:hint="eastAsia"/>
+          <w:b/>
+          <w:bCs/>
+          <w:color w:val="000000"/>
+          <w:sz w:val="20"/>
+          <w:szCs w:val="20"/>
+        </w:rPr>
+        <w:t xml:space="preserve">            </w:t>
+      </w:r>
+      <w:r>
+        <w:rPr>
+          <w:rFonts w:ascii="Times New Roman" w:hAnsi="Times New Roman" w:cs="Times New Roman" w:hint="eastAsia"/>
+          <w:b/>
+          <w:bCs/>
+          <w:color w:val="000000"/>
+          <w:sz w:val="20"/>
+          <w:szCs w:val="20"/>
+        </w:rPr>
+        <w:t xml:space="preserve"> </w:t>
+      </w:r>
+      <w:r>
+        <w:rPr>
+          <w:rFonts w:ascii="Times New Roman" w:hAnsi="Times New Roman" w:cs="Times New Roman"/>
+          <w:b/>
+          <w:bCs/>
+          <w:color w:val="000000"/>
+          <w:sz w:val="20"/>
+          <w:szCs w:val="20"/>
+        </w:rPr>
+        <w:t>July</w:t>
+      </w:r>
+      <w:r>
+        <w:rPr>
+          <w:rFonts w:ascii="Times New Roman" w:hAnsi="Times New Roman" w:cs="Times New Roman"/>
+          <w:b/>
+          <w:bCs/>
+          <w:color w:val="000000"/>
+          <w:sz w:val="20"/>
+          <w:szCs w:val="20"/>
+        </w:rPr>
+        <w:t>.</w:t>
+      </w:r>
+      <w:r>
+        <w:rPr>
+          <w:rFonts w:ascii="Times New Roman" w:hAnsi="Times New Roman" w:cs="Times New Roman" w:hint="eastAsia"/>
+          <w:b/>
+          <w:bCs/>
+          <w:color w:val="000000"/>
+          <w:sz w:val="20"/>
+          <w:szCs w:val="20"/>
+        </w:rPr>
+        <w:t xml:space="preserve"> </w:t>
+      </w:r>
+      <w:r>
+        <w:rPr>
+          <w:rFonts w:ascii="Times New Roman" w:hAnsi="Times New Roman" w:cs="Times New Roman"/>
+          <w:b/>
+          <w:bCs/>
+          <w:color w:val="000000"/>
+          <w:sz w:val="20"/>
+          <w:szCs w:val="20"/>
+        </w:rPr>
+        <w:t xml:space="preserve">2023- </w:t>
+      </w:r>
+      <w:r>
+        <w:rPr>
+          <w:rFonts w:ascii="Times New Roman" w:hAnsi="Times New Roman" w:cs="Times New Roman" w:hint="eastAsia"/>
+          <w:b/>
+          <w:bCs/>
+          <w:color w:val="000000"/>
+          <w:sz w:val="20"/>
+          <w:szCs w:val="20"/>
+        </w:rPr>
+        <w:t>Jan. 2025</w:t>
       </w:r>
     </w:p>
     <w:p>
@@ -3086,122 +3199,11 @@
           <w:sz w:val="20"/>
           <w:szCs w:val="20"/>
         </w:rPr>
-        <w:t xml:space="preserve">Computer Vision and </w:t>
-      </w:r>
-      <w:r>
-        <w:rPr>
-          <w:rFonts w:ascii="Times New Roman" w:hAnsi="Times New Roman" w:cs="Times New Roman"/>
-          <w:b/>
-          <w:bCs/>
-          <w:color w:val="000000"/>
-          <w:sz w:val="20"/>
-          <w:szCs w:val="20"/>
-        </w:rPr>
-        <w:t>Deep</w:t>
-      </w:r>
-      <w:r>
-        <w:rPr>
-          <w:rFonts w:ascii="Times New Roman" w:hAnsi="Times New Roman" w:cs="Times New Roman"/>
-          <w:b/>
-          <w:bCs/>
-          <w:color w:val="000000"/>
-          <w:sz w:val="20"/>
-          <w:szCs w:val="20"/>
-        </w:rPr>
-        <w:t xml:space="preserve"> Learning | </w:t>
-      </w:r>
-      <w:r>
-        <w:rPr>
-          <w:rFonts w:ascii="Times New Roman" w:hAnsi="Times New Roman" w:cs="Times New Roman" w:hint="eastAsia"/>
-          <w:b/>
-          <w:bCs/>
-          <w:color w:val="000000"/>
-          <w:sz w:val="20"/>
-          <w:szCs w:val="20"/>
-        </w:rPr>
-        <w:t>R</w:t>
-      </w:r>
-      <w:r>
-        <w:rPr>
-          <w:rFonts w:ascii="Times New Roman" w:hAnsi="Times New Roman" w:cs="Times New Roman"/>
-          <w:b/>
-          <w:bCs/>
-          <w:color w:val="000000"/>
-          <w:sz w:val="20"/>
-          <w:szCs w:val="20"/>
-        </w:rPr>
-        <w:t>esearch Assistant</w:t>
-      </w:r>
-      <w:r>
-        <w:rPr>
-          <w:rFonts w:ascii="Times New Roman" w:hAnsi="Times New Roman" w:cs="Times New Roman"/>
-          <w:b/>
-          <w:bCs/>
-          <w:color w:val="000000"/>
-          <w:sz w:val="20"/>
-          <w:szCs w:val="20"/>
-        </w:rPr>
-        <w:tab/>
-      </w:r>
-      <w:r>
-        <w:rPr>
-          <w:rFonts w:ascii="Times New Roman" w:hAnsi="Times New Roman" w:cs="Times New Roman"/>
-          <w:b/>
-          <w:bCs/>
-          <w:color w:val="000000"/>
-          <w:sz w:val="20"/>
-          <w:szCs w:val="20"/>
-        </w:rPr>
-        <w:tab/>
-      </w:r>
-      <w:r>
-        <w:rPr>
-          <w:rFonts w:ascii="Times New Roman" w:hAnsi="Times New Roman" w:cs="Times New Roman"/>
-          <w:b/>
-          <w:bCs/>
-          <w:color w:val="000000"/>
-          <w:sz w:val="20"/>
-          <w:szCs w:val="20"/>
-        </w:rPr>
-        <w:tab/>
-      </w:r>
-      <w:r>
-        <w:rPr>
-          <w:rFonts w:ascii="Times New Roman" w:hAnsi="Times New Roman" w:cs="Times New Roman"/>
-          <w:b/>
-          <w:bCs/>
-          <w:color w:val="000000"/>
-          <w:sz w:val="20"/>
-          <w:szCs w:val="20"/>
-        </w:rPr>
-        <w:tab/>
-      </w:r>
-      <w:r>
-        <w:rPr>
-          <w:rFonts w:ascii="Times New Roman" w:hAnsi="Times New Roman" w:cs="Times New Roman"/>
-          <w:b/>
-          <w:bCs/>
-          <w:color w:val="000000"/>
-          <w:sz w:val="20"/>
-          <w:szCs w:val="20"/>
-        </w:rPr>
-        <w:tab/>
-      </w:r>
-      <w:r>
-        <w:rPr>
-          <w:rFonts w:ascii="Times New Roman" w:hAnsi="Times New Roman" w:cs="Times New Roman"/>
-          <w:b/>
-          <w:bCs/>
-          <w:color w:val="000000"/>
-          <w:sz w:val="20"/>
-          <w:szCs w:val="20"/>
-        </w:rPr>
-        <w:tab/>
-        <w:t xml:space="preserve">      </w:t>
-      </w:r>
-      <w:r>
-        <w:rPr>
-          <w:rFonts w:ascii="Times New Roman" w:hAnsi="Times New Roman" w:cs="Times New Roman"/>
+        <w:t>Imperial College London</w:t>
+      </w:r>
+      <w:r>
+        <w:rPr>
+          <w:rFonts w:ascii="Times New Roman" w:hAnsi="Times New Roman" w:cs="Times New Roman" w:hint="eastAsia"/>
           <w:b/>
           <w:bCs/>
           <w:color w:val="000000"/>
@@ -3212,29 +3214,151 @@
       </w:r>
       <w:r>
         <w:rPr>
-          <w:rFonts w:ascii="Times New Roman" w:hAnsi="Times New Roman" w:cs="Times New Roman"/>
-          <w:b/>
-          <w:bCs/>
-          <w:color w:val="000000"/>
-          <w:sz w:val="20"/>
-          <w:szCs w:val="20"/>
-        </w:rPr>
-        <w:t xml:space="preserve">  </w:t>
-      </w:r>
-      <w:r>
-        <w:rPr>
-          <w:rFonts w:ascii="Times New Roman" w:hAnsi="Times New Roman" w:cs="Times New Roman" w:hint="eastAsia"/>
-          <w:b/>
-          <w:bCs/>
-          <w:color w:val="000000"/>
-          <w:sz w:val="20"/>
-          <w:szCs w:val="20"/>
-        </w:rPr>
-        <w:t xml:space="preserve">       </w:t>
-      </w:r>
-      <w:r>
-        <w:rPr>
-          <w:rFonts w:ascii="Times New Roman" w:hAnsi="Times New Roman" w:cs="Times New Roman"/>
+          <w:rFonts w:ascii="Times New Roman" w:hAnsi="Times New Roman" w:cs="Times New Roman" w:hint="eastAsia"/>
+          <w:color w:val="000000"/>
+          <w:sz w:val="20"/>
+          <w:szCs w:val="20"/>
+        </w:rPr>
+        <w:t>(</w:t>
+      </w:r>
+      <w:r>
+        <w:rPr>
+          <w:rFonts w:ascii="Times New Roman" w:hAnsi="Times New Roman" w:cs="Times New Roman"/>
+          <w:b/>
+          <w:bCs/>
+          <w:color w:val="000000"/>
+          <w:sz w:val="20"/>
+          <w:szCs w:val="20"/>
+        </w:rPr>
+        <w:t>Supervisor</w:t>
+      </w:r>
+      <w:r>
+        <w:rPr>
+          <w:rFonts w:ascii="Times New Roman" w:hAnsi="Times New Roman" w:cs="Times New Roman"/>
+          <w:color w:val="000000"/>
+          <w:sz w:val="20"/>
+          <w:szCs w:val="20"/>
+        </w:rPr>
+        <w:t xml:space="preserve">: </w:t>
+      </w:r>
+      <w:r>
+        <w:rPr>
+          <w:rFonts w:ascii="Times New Roman" w:hAnsi="Times New Roman" w:cs="Times New Roman" w:hint="eastAsia"/>
+          <w:color w:val="000000"/>
+          <w:sz w:val="20"/>
+          <w:szCs w:val="20"/>
+        </w:rPr>
+        <w:t xml:space="preserve">Assoc. </w:t>
+      </w:r>
+      <w:r>
+        <w:rPr>
+          <w:rFonts w:ascii="Times New Roman" w:hAnsi="Times New Roman" w:cs="Times New Roman"/>
+          <w:color w:val="000000"/>
+          <w:sz w:val="20"/>
+          <w:szCs w:val="20"/>
+        </w:rPr>
+        <w:t xml:space="preserve">Prof. Dalal </w:t>
+      </w:r>
+      <w:proofErr w:type="spellStart"/>
+      <w:r>
+        <w:rPr>
+          <w:rFonts w:ascii="Times New Roman" w:hAnsi="Times New Roman" w:cs="Times New Roman"/>
+          <w:color w:val="000000"/>
+          <w:sz w:val="20"/>
+          <w:szCs w:val="20"/>
+        </w:rPr>
+        <w:t>Alrajeh</w:t>
+      </w:r>
+      <w:proofErr w:type="spellEnd"/>
+      <w:r>
+        <w:rPr>
+          <w:rFonts w:ascii="Times New Roman" w:hAnsi="Times New Roman" w:cs="Times New Roman" w:hint="eastAsia"/>
+          <w:color w:val="000000"/>
+          <w:sz w:val="20"/>
+          <w:szCs w:val="20"/>
+        </w:rPr>
+        <w:t>)</w:t>
+      </w:r>
+      <w:r>
+        <w:rPr>
+          <w:rFonts w:ascii="Times New Roman" w:hAnsi="Times New Roman" w:cs="Times New Roman"/>
+          <w:b/>
+          <w:bCs/>
+          <w:color w:val="000000"/>
+          <w:sz w:val="20"/>
+          <w:szCs w:val="20"/>
+        </w:rPr>
+        <w:tab/>
+      </w:r>
+      <w:r>
+        <w:rPr>
+          <w:rFonts w:ascii="Times New Roman" w:hAnsi="Times New Roman" w:cs="Times New Roman"/>
+          <w:b/>
+          <w:bCs/>
+          <w:color w:val="000000"/>
+          <w:sz w:val="20"/>
+          <w:szCs w:val="20"/>
+        </w:rPr>
+        <w:tab/>
+      </w:r>
+      <w:r>
+        <w:rPr>
+          <w:rFonts w:ascii="Times New Roman" w:hAnsi="Times New Roman" w:cs="Times New Roman"/>
+          <w:b/>
+          <w:bCs/>
+          <w:color w:val="000000"/>
+          <w:sz w:val="20"/>
+          <w:szCs w:val="20"/>
+        </w:rPr>
+        <w:tab/>
+      </w:r>
+      <w:r>
+        <w:rPr>
+          <w:rFonts w:ascii="Times New Roman" w:hAnsi="Times New Roman" w:cs="Times New Roman"/>
+          <w:b/>
+          <w:bCs/>
+          <w:color w:val="000000"/>
+          <w:sz w:val="20"/>
+          <w:szCs w:val="20"/>
+        </w:rPr>
+        <w:tab/>
+      </w:r>
+      <w:r>
+        <w:rPr>
+          <w:rFonts w:ascii="Times New Roman" w:hAnsi="Times New Roman" w:cs="Times New Roman"/>
+          <w:b/>
+          <w:bCs/>
+          <w:color w:val="000000"/>
+          <w:sz w:val="20"/>
+          <w:szCs w:val="20"/>
+        </w:rPr>
+        <w:tab/>
+      </w:r>
+      <w:r>
+        <w:rPr>
+          <w:rFonts w:ascii="Times New Roman" w:hAnsi="Times New Roman" w:cs="Times New Roman"/>
+          <w:b/>
+          <w:bCs/>
+          <w:color w:val="000000"/>
+          <w:sz w:val="20"/>
+          <w:szCs w:val="20"/>
+        </w:rPr>
+        <w:tab/>
+      </w:r>
+      <w:r>
+        <w:rPr>
+          <w:rFonts w:ascii="Times New Roman" w:hAnsi="Times New Roman" w:cs="Times New Roman" w:hint="eastAsia"/>
+          <w:b/>
+          <w:bCs/>
+          <w:color w:val="000000"/>
+          <w:sz w:val="20"/>
+          <w:szCs w:val="20"/>
+        </w:rPr>
+        <w:t xml:space="preserve">         </w:t>
+      </w:r>
+      <w:r>
+        <w:rPr>
+          <w:rFonts w:ascii="Times New Roman" w:hAnsi="Times New Roman" w:cs="Times New Roman" w:hint="eastAsia"/>
           <w:b/>
           <w:bCs/>
           <w:color w:val="000000"/>
@@ -3252,40 +3376,76 @@
           <w:sz w:val="20"/>
           <w:szCs w:val="20"/>
         </w:rPr>
-        <w:t>A</w:t>
-      </w:r>
-      <w:r>
-        <w:rPr>
-          <w:rFonts w:ascii="Times New Roman" w:hAnsi="Times New Roman" w:cs="Times New Roman" w:hint="eastAsia"/>
-          <w:b/>
-          <w:bCs/>
-          <w:color w:val="000000"/>
-          <w:sz w:val="20"/>
-          <w:szCs w:val="20"/>
-        </w:rPr>
-        <w:t>pril</w:t>
-      </w:r>
-      <w:r>
-        <w:rPr>
-          <w:rFonts w:ascii="Times New Roman" w:hAnsi="Times New Roman" w:cs="Times New Roman"/>
-          <w:b/>
-          <w:bCs/>
-          <w:color w:val="000000"/>
-          <w:sz w:val="20"/>
-          <w:szCs w:val="20"/>
-        </w:rPr>
-        <w:t>.2023-</w:t>
-      </w:r>
-      <w:r>
-        <w:rPr>
-          <w:rFonts w:ascii="Times New Roman" w:hAnsi="Times New Roman" w:cs="Times New Roman"/>
-          <w:b/>
-          <w:bCs/>
-          <w:color w:val="000000"/>
-          <w:sz w:val="20"/>
-          <w:szCs w:val="20"/>
-        </w:rPr>
-        <w:t xml:space="preserve"> Dec.2023</w:t>
+        <w:t>London, U</w:t>
+      </w:r>
+      <w:r>
+        <w:rPr>
+          <w:rFonts w:ascii="Times New Roman" w:hAnsi="Times New Roman" w:cs="Times New Roman" w:hint="eastAsia"/>
+          <w:b/>
+          <w:bCs/>
+          <w:color w:val="000000"/>
+          <w:sz w:val="20"/>
+          <w:szCs w:val="20"/>
+        </w:rPr>
+        <w:t xml:space="preserve">nited </w:t>
+      </w:r>
+      <w:r>
+        <w:rPr>
+          <w:rFonts w:ascii="Times New Roman" w:hAnsi="Times New Roman" w:cs="Times New Roman"/>
+          <w:b/>
+          <w:bCs/>
+          <w:color w:val="000000"/>
+          <w:sz w:val="20"/>
+          <w:szCs w:val="20"/>
+        </w:rPr>
+        <w:t>K</w:t>
+      </w:r>
+      <w:r>
+        <w:rPr>
+          <w:rFonts w:ascii="Times New Roman" w:hAnsi="Times New Roman" w:cs="Times New Roman" w:hint="eastAsia"/>
+          <w:b/>
+          <w:bCs/>
+          <w:color w:val="000000"/>
+          <w:sz w:val="20"/>
+          <w:szCs w:val="20"/>
+        </w:rPr>
+        <w:t>ingdom</w:t>
+      </w:r>
+    </w:p>
+    <w:p>
+      <w:pPr>
+        <w:pStyle w:val="ad"/>
+        <w:numPr>
+          <w:ilvl w:val="0"/>
+          <w:numId w:val="9"/>
+        </w:numPr>
+        <w:spacing w:before="0" w:beforeAutospacing="0" w:after="0" w:afterAutospacing="0"/>
+        <w:ind w:leftChars="-250" w:left="-240" w:rightChars="-250" w:right="-600"/>
+        <w:textAlignment w:val="baseline"/>
+        <w:rPr>
+          <w:rFonts w:ascii="Times New Roman" w:hAnsi="Times New Roman" w:cs="Times New Roman"/>
+          <w:color w:val="000000"/>
+          <w:sz w:val="20"/>
+          <w:szCs w:val="20"/>
+        </w:rPr>
+      </w:pPr>
+      <w:r>
+        <w:rPr>
+          <w:rFonts w:ascii="Times New Roman" w:hAnsi="Times New Roman" w:cs="Times New Roman"/>
+          <w:color w:val="000000"/>
+          <w:sz w:val="20"/>
+          <w:szCs w:val="20"/>
+        </w:rPr>
+        <w:t>D</w:t>
+      </w:r>
+      <w:r>
+        <w:rPr>
+          <w:rFonts w:ascii="Times New Roman" w:hAnsi="Times New Roman" w:cs="Times New Roman"/>
+          <w:color w:val="000000"/>
+          <w:sz w:val="20"/>
+          <w:szCs w:val="20"/>
+        </w:rPr>
+        <w:t>esigned advanced machine learning networks to enhance efficiency and accuracy in crime linkage analysis.</w:t>
       </w:r>
     </w:p>
     <w:p>
@@ -3311,229 +3471,488 @@
           <w:sz w:val="20"/>
           <w:szCs w:val="20"/>
         </w:rPr>
+        <w:t xml:space="preserve">Computer Vision | </w:t>
+      </w:r>
+      <w:r>
+        <w:rPr>
+          <w:rFonts w:ascii="Times New Roman" w:hAnsi="Times New Roman" w:cs="Times New Roman" w:hint="eastAsia"/>
+          <w:b/>
+          <w:bCs/>
+          <w:color w:val="000000"/>
+          <w:sz w:val="20"/>
+          <w:szCs w:val="20"/>
+        </w:rPr>
+        <w:t>R</w:t>
+      </w:r>
+      <w:r>
+        <w:rPr>
+          <w:rFonts w:ascii="Times New Roman" w:hAnsi="Times New Roman" w:cs="Times New Roman"/>
+          <w:b/>
+          <w:bCs/>
+          <w:color w:val="000000"/>
+          <w:sz w:val="20"/>
+          <w:szCs w:val="20"/>
+        </w:rPr>
+        <w:t>esearch Assistant</w:t>
+      </w:r>
+      <w:r>
+        <w:rPr>
+          <w:rFonts w:ascii="Times New Roman" w:hAnsi="Times New Roman" w:cs="Times New Roman"/>
+          <w:b/>
+          <w:bCs/>
+          <w:color w:val="000000"/>
+          <w:sz w:val="20"/>
+          <w:szCs w:val="20"/>
+        </w:rPr>
+        <w:tab/>
+      </w:r>
+      <w:r>
+        <w:rPr>
+          <w:rFonts w:ascii="Times New Roman" w:hAnsi="Times New Roman" w:cs="Times New Roman"/>
+          <w:b/>
+          <w:bCs/>
+          <w:color w:val="000000"/>
+          <w:sz w:val="20"/>
+          <w:szCs w:val="20"/>
+        </w:rPr>
+        <w:tab/>
+      </w:r>
+      <w:r>
+        <w:rPr>
+          <w:rFonts w:ascii="Times New Roman" w:hAnsi="Times New Roman" w:cs="Times New Roman"/>
+          <w:b/>
+          <w:bCs/>
+          <w:color w:val="000000"/>
+          <w:sz w:val="20"/>
+          <w:szCs w:val="20"/>
+        </w:rPr>
+        <w:tab/>
+      </w:r>
+      <w:r>
+        <w:rPr>
+          <w:rFonts w:ascii="Times New Roman" w:hAnsi="Times New Roman" w:cs="Times New Roman"/>
+          <w:b/>
+          <w:bCs/>
+          <w:color w:val="000000"/>
+          <w:sz w:val="20"/>
+          <w:szCs w:val="20"/>
+        </w:rPr>
+        <w:tab/>
+      </w:r>
+      <w:r>
+        <w:rPr>
+          <w:rFonts w:ascii="Times New Roman" w:hAnsi="Times New Roman" w:cs="Times New Roman"/>
+          <w:b/>
+          <w:bCs/>
+          <w:color w:val="000000"/>
+          <w:sz w:val="20"/>
+          <w:szCs w:val="20"/>
+        </w:rPr>
+        <w:tab/>
+      </w:r>
+      <w:r>
+        <w:rPr>
+          <w:rFonts w:ascii="Times New Roman" w:hAnsi="Times New Roman" w:cs="Times New Roman"/>
+          <w:b/>
+          <w:bCs/>
+          <w:color w:val="000000"/>
+          <w:sz w:val="20"/>
+          <w:szCs w:val="20"/>
+        </w:rPr>
+        <w:tab/>
+        <w:t xml:space="preserve">      </w:t>
+      </w:r>
+      <w:r>
+        <w:rPr>
+          <w:rFonts w:ascii="Times New Roman" w:hAnsi="Times New Roman" w:cs="Times New Roman"/>
+          <w:b/>
+          <w:bCs/>
+          <w:color w:val="000000"/>
+          <w:sz w:val="20"/>
+          <w:szCs w:val="20"/>
+        </w:rPr>
+        <w:t xml:space="preserve"> </w:t>
+      </w:r>
+      <w:r>
+        <w:rPr>
+          <w:rFonts w:ascii="Times New Roman" w:hAnsi="Times New Roman" w:cs="Times New Roman"/>
+          <w:b/>
+          <w:bCs/>
+          <w:color w:val="000000"/>
+          <w:sz w:val="20"/>
+          <w:szCs w:val="20"/>
+        </w:rPr>
+        <w:t xml:space="preserve">  </w:t>
+      </w:r>
+      <w:r>
+        <w:rPr>
+          <w:rFonts w:ascii="Times New Roman" w:hAnsi="Times New Roman" w:cs="Times New Roman" w:hint="eastAsia"/>
+          <w:b/>
+          <w:bCs/>
+          <w:color w:val="000000"/>
+          <w:sz w:val="20"/>
+          <w:szCs w:val="20"/>
+        </w:rPr>
+        <w:t xml:space="preserve">       </w:t>
+      </w:r>
+      <w:r>
+        <w:rPr>
+          <w:rFonts w:ascii="Times New Roman" w:hAnsi="Times New Roman" w:cs="Times New Roman"/>
+          <w:b/>
+          <w:bCs/>
+          <w:color w:val="000000"/>
+          <w:sz w:val="20"/>
+          <w:szCs w:val="20"/>
+        </w:rPr>
+        <w:t xml:space="preserve"> </w:t>
+      </w:r>
+      <w:r>
+        <w:rPr>
+          <w:rFonts w:ascii="Times New Roman" w:hAnsi="Times New Roman" w:cs="Times New Roman"/>
+          <w:b/>
+          <w:bCs/>
+          <w:color w:val="000000"/>
+          <w:sz w:val="20"/>
+          <w:szCs w:val="20"/>
+        </w:rPr>
+        <w:tab/>
+      </w:r>
+      <w:r>
+        <w:rPr>
+          <w:rFonts w:ascii="Times New Roman" w:hAnsi="Times New Roman" w:cs="Times New Roman"/>
+          <w:b/>
+          <w:bCs/>
+          <w:color w:val="000000"/>
+          <w:sz w:val="20"/>
+          <w:szCs w:val="20"/>
+        </w:rPr>
+        <w:tab/>
+      </w:r>
+      <w:r>
+        <w:rPr>
+          <w:rFonts w:ascii="Times New Roman" w:hAnsi="Times New Roman" w:cs="Times New Roman"/>
+          <w:b/>
+          <w:bCs/>
+          <w:color w:val="000000"/>
+          <w:sz w:val="20"/>
+          <w:szCs w:val="20"/>
+        </w:rPr>
+        <w:tab/>
+      </w:r>
+      <w:proofErr w:type="gramStart"/>
+      <w:r>
+        <w:rPr>
+          <w:rFonts w:ascii="Times New Roman" w:hAnsi="Times New Roman" w:cs="Times New Roman"/>
+          <w:b/>
+          <w:bCs/>
+          <w:color w:val="000000"/>
+          <w:sz w:val="20"/>
+          <w:szCs w:val="20"/>
+        </w:rPr>
+        <w:tab/>
+      </w:r>
+      <w:r>
+        <w:rPr>
+          <w:rFonts w:ascii="Times New Roman" w:hAnsi="Times New Roman" w:cs="Times New Roman" w:hint="eastAsia"/>
+          <w:b/>
+          <w:bCs/>
+          <w:color w:val="000000"/>
+          <w:sz w:val="20"/>
+          <w:szCs w:val="20"/>
+        </w:rPr>
+        <w:t xml:space="preserve"> </w:t>
+      </w:r>
+      <w:r>
+        <w:rPr>
+          <w:rFonts w:ascii="Times New Roman" w:hAnsi="Times New Roman" w:cs="Times New Roman" w:hint="eastAsia"/>
+          <w:b/>
+          <w:bCs/>
+          <w:color w:val="000000"/>
+          <w:sz w:val="20"/>
+          <w:szCs w:val="20"/>
+        </w:rPr>
+        <w:t xml:space="preserve"> </w:t>
+      </w:r>
+      <w:r>
+        <w:rPr>
+          <w:rFonts w:ascii="Times New Roman" w:hAnsi="Times New Roman" w:cs="Times New Roman"/>
+          <w:b/>
+          <w:bCs/>
+          <w:color w:val="000000"/>
+          <w:sz w:val="20"/>
+          <w:szCs w:val="20"/>
+        </w:rPr>
+        <w:t>A</w:t>
+      </w:r>
+      <w:r>
+        <w:rPr>
+          <w:rFonts w:ascii="Times New Roman" w:hAnsi="Times New Roman" w:cs="Times New Roman" w:hint="eastAsia"/>
+          <w:b/>
+          <w:bCs/>
+          <w:color w:val="000000"/>
+          <w:sz w:val="20"/>
+          <w:szCs w:val="20"/>
+        </w:rPr>
+        <w:t>pr</w:t>
+      </w:r>
+      <w:r>
+        <w:rPr>
+          <w:rFonts w:ascii="Times New Roman" w:hAnsi="Times New Roman" w:cs="Times New Roman"/>
+          <w:b/>
+          <w:bCs/>
+          <w:color w:val="000000"/>
+          <w:sz w:val="20"/>
+          <w:szCs w:val="20"/>
+        </w:rPr>
+        <w:t>.</w:t>
+      </w:r>
+      <w:proofErr w:type="gramEnd"/>
+      <w:r>
+        <w:rPr>
+          <w:rFonts w:ascii="Times New Roman" w:hAnsi="Times New Roman" w:cs="Times New Roman" w:hint="eastAsia"/>
+          <w:b/>
+          <w:bCs/>
+          <w:color w:val="000000"/>
+          <w:sz w:val="20"/>
+          <w:szCs w:val="20"/>
+        </w:rPr>
+        <w:t xml:space="preserve"> </w:t>
+      </w:r>
+      <w:r>
+        <w:rPr>
+          <w:rFonts w:ascii="Times New Roman" w:hAnsi="Times New Roman" w:cs="Times New Roman"/>
+          <w:b/>
+          <w:bCs/>
+          <w:color w:val="000000"/>
+          <w:sz w:val="20"/>
+          <w:szCs w:val="20"/>
+        </w:rPr>
+        <w:t>2023-</w:t>
+      </w:r>
+      <w:r>
+        <w:rPr>
+          <w:rFonts w:ascii="Times New Roman" w:hAnsi="Times New Roman" w:cs="Times New Roman"/>
+          <w:b/>
+          <w:bCs/>
+          <w:color w:val="000000"/>
+          <w:sz w:val="20"/>
+          <w:szCs w:val="20"/>
+        </w:rPr>
+        <w:t xml:space="preserve"> Dec.2023</w:t>
+      </w:r>
+    </w:p>
+    <w:p>
+      <w:pPr>
+        <w:pStyle w:val="ad"/>
+        <w:spacing w:before="0" w:beforeAutospacing="0" w:after="0" w:afterAutospacing="0"/>
+        <w:ind w:leftChars="-250" w:left="-600" w:rightChars="-250" w:right="-600"/>
+        <w:rPr>
+          <w:rFonts w:ascii="Times New Roman" w:hAnsi="Times New Roman" w:cs="Times New Roman"/>
+          <w:b/>
+          <w:bCs/>
+          <w:color w:val="000000"/>
+          <w:sz w:val="20"/>
+          <w:szCs w:val="20"/>
+        </w:rPr>
+      </w:pPr>
+      <w:r>
+        <w:rPr>
+          <w:rFonts w:ascii="Times New Roman" w:hAnsi="Times New Roman" w:cs="Times New Roman"/>
+          <w:b/>
+          <w:bCs/>
+          <w:color w:val="000000"/>
+          <w:sz w:val="20"/>
+          <w:szCs w:val="20"/>
+        </w:rPr>
         <w:t>University of Leeds</w:t>
       </w:r>
       <w:r>
         <w:rPr>
-          <w:rFonts w:ascii="Times New Roman" w:hAnsi="Times New Roman" w:cs="Times New Roman"/>
-          <w:b/>
-          <w:bCs/>
-          <w:color w:val="000000"/>
-          <w:sz w:val="20"/>
-          <w:szCs w:val="20"/>
-        </w:rPr>
-        <w:tab/>
-      </w:r>
-      <w:r>
-        <w:rPr>
-          <w:rFonts w:ascii="Times New Roman" w:hAnsi="Times New Roman" w:cs="Times New Roman"/>
-          <w:b/>
-          <w:bCs/>
-          <w:color w:val="000000"/>
-          <w:sz w:val="20"/>
-          <w:szCs w:val="20"/>
-        </w:rPr>
-        <w:tab/>
-      </w:r>
-      <w:r>
-        <w:rPr>
-          <w:rFonts w:ascii="Times New Roman" w:hAnsi="Times New Roman" w:cs="Times New Roman"/>
-          <w:b/>
-          <w:bCs/>
-          <w:color w:val="000000"/>
-          <w:sz w:val="20"/>
-          <w:szCs w:val="20"/>
-        </w:rPr>
-        <w:tab/>
-      </w:r>
-      <w:r>
-        <w:rPr>
-          <w:rFonts w:ascii="Times New Roman" w:hAnsi="Times New Roman" w:cs="Times New Roman"/>
-          <w:b/>
-          <w:bCs/>
-          <w:color w:val="000000"/>
-          <w:sz w:val="20"/>
-          <w:szCs w:val="20"/>
-        </w:rPr>
-        <w:tab/>
-      </w:r>
-      <w:r>
-        <w:rPr>
-          <w:rFonts w:ascii="Times New Roman" w:hAnsi="Times New Roman" w:cs="Times New Roman"/>
-          <w:b/>
-          <w:bCs/>
-          <w:color w:val="000000"/>
-          <w:sz w:val="20"/>
-          <w:szCs w:val="20"/>
-        </w:rPr>
-        <w:tab/>
-      </w:r>
-      <w:r>
-        <w:rPr>
-          <w:rFonts w:ascii="Times New Roman" w:hAnsi="Times New Roman" w:cs="Times New Roman"/>
-          <w:b/>
-          <w:bCs/>
-          <w:color w:val="000000"/>
-          <w:sz w:val="20"/>
-          <w:szCs w:val="20"/>
-        </w:rPr>
-        <w:tab/>
-      </w:r>
-      <w:r>
-        <w:rPr>
-          <w:rFonts w:ascii="Times New Roman" w:hAnsi="Times New Roman" w:cs="Times New Roman"/>
-          <w:b/>
-          <w:bCs/>
-          <w:color w:val="000000"/>
-          <w:sz w:val="20"/>
-          <w:szCs w:val="20"/>
-        </w:rPr>
-        <w:tab/>
-      </w:r>
-      <w:r>
-        <w:rPr>
-          <w:rFonts w:ascii="Times New Roman" w:hAnsi="Times New Roman" w:cs="Times New Roman"/>
-          <w:b/>
-          <w:bCs/>
-          <w:color w:val="000000"/>
-          <w:sz w:val="20"/>
-          <w:szCs w:val="20"/>
-        </w:rPr>
-        <w:tab/>
-      </w:r>
-      <w:r>
-        <w:rPr>
-          <w:rFonts w:ascii="Times New Roman" w:hAnsi="Times New Roman" w:cs="Times New Roman"/>
-          <w:b/>
-          <w:bCs/>
-          <w:color w:val="000000"/>
-          <w:sz w:val="20"/>
-          <w:szCs w:val="20"/>
-        </w:rPr>
-        <w:tab/>
-      </w:r>
-      <w:r>
-        <w:rPr>
-          <w:rFonts w:ascii="Times New Roman" w:hAnsi="Times New Roman" w:cs="Times New Roman"/>
-          <w:b/>
-          <w:bCs/>
-          <w:color w:val="000000"/>
-          <w:sz w:val="20"/>
-          <w:szCs w:val="20"/>
-        </w:rPr>
-        <w:tab/>
-      </w:r>
-      <w:r>
-        <w:rPr>
-          <w:rFonts w:ascii="Times New Roman" w:hAnsi="Times New Roman" w:cs="Times New Roman"/>
-          <w:b/>
-          <w:bCs/>
-          <w:color w:val="000000"/>
-          <w:sz w:val="20"/>
-          <w:szCs w:val="20"/>
-        </w:rPr>
-        <w:tab/>
-      </w:r>
-      <w:r>
-        <w:rPr>
-          <w:rFonts w:ascii="Times New Roman" w:hAnsi="Times New Roman" w:cs="Times New Roman"/>
-          <w:b/>
-          <w:bCs/>
-          <w:color w:val="000000"/>
-          <w:sz w:val="20"/>
-          <w:szCs w:val="20"/>
-        </w:rPr>
-        <w:tab/>
-      </w:r>
-      <w:r>
-        <w:rPr>
-          <w:rFonts w:ascii="Times New Roman" w:hAnsi="Times New Roman" w:cs="Times New Roman"/>
-          <w:b/>
-          <w:bCs/>
-          <w:color w:val="000000"/>
-          <w:sz w:val="20"/>
-          <w:szCs w:val="20"/>
-        </w:rPr>
-        <w:tab/>
-      </w:r>
-      <w:r>
-        <w:rPr>
-          <w:rFonts w:ascii="Times New Roman" w:hAnsi="Times New Roman" w:cs="Times New Roman"/>
-          <w:b/>
-          <w:bCs/>
-          <w:color w:val="000000"/>
-          <w:sz w:val="20"/>
-          <w:szCs w:val="20"/>
-        </w:rPr>
-        <w:tab/>
-      </w:r>
-      <w:r>
-        <w:rPr>
-          <w:rFonts w:ascii="Times New Roman" w:hAnsi="Times New Roman" w:cs="Times New Roman"/>
-          <w:b/>
-          <w:bCs/>
-          <w:color w:val="000000"/>
-          <w:sz w:val="20"/>
-          <w:szCs w:val="20"/>
-        </w:rPr>
-        <w:tab/>
-      </w:r>
-      <w:r>
-        <w:rPr>
-          <w:rFonts w:ascii="Times New Roman" w:hAnsi="Times New Roman" w:cs="Times New Roman"/>
-          <w:b/>
-          <w:bCs/>
-          <w:color w:val="000000"/>
-          <w:sz w:val="20"/>
-          <w:szCs w:val="20"/>
-        </w:rPr>
-        <w:tab/>
-      </w:r>
-      <w:proofErr w:type="gramStart"/>
-      <w:r>
-        <w:rPr>
-          <w:rFonts w:ascii="Times New Roman" w:hAnsi="Times New Roman" w:cs="Times New Roman"/>
-          <w:b/>
-          <w:bCs/>
-          <w:color w:val="000000"/>
-          <w:sz w:val="20"/>
-          <w:szCs w:val="20"/>
-        </w:rPr>
-        <w:tab/>
-      </w:r>
-      <w:r>
-        <w:rPr>
-          <w:rFonts w:ascii="Times New Roman" w:hAnsi="Times New Roman" w:cs="Times New Roman" w:hint="eastAsia"/>
-          <w:b/>
-          <w:bCs/>
-          <w:color w:val="000000"/>
-          <w:sz w:val="20"/>
-          <w:szCs w:val="20"/>
-        </w:rPr>
-        <w:t xml:space="preserve">  </w:t>
-      </w:r>
-      <w:r>
-        <w:rPr>
-          <w:rFonts w:ascii="Times New Roman" w:hAnsi="Times New Roman" w:cs="Times New Roman"/>
-          <w:b/>
-          <w:bCs/>
-          <w:color w:val="000000"/>
-          <w:sz w:val="20"/>
-          <w:szCs w:val="20"/>
-        </w:rPr>
-        <w:t>Leeds</w:t>
-      </w:r>
-      <w:proofErr w:type="gramEnd"/>
-      <w:r>
-        <w:rPr>
-          <w:rFonts w:ascii="Times New Roman" w:hAnsi="Times New Roman" w:cs="Times New Roman"/>
-          <w:b/>
-          <w:bCs/>
-          <w:color w:val="000000"/>
-          <w:sz w:val="20"/>
-          <w:szCs w:val="20"/>
-        </w:rPr>
-        <w:t xml:space="preserve">, </w:t>
+          <w:rFonts w:ascii="Times New Roman" w:hAnsi="Times New Roman" w:cs="Times New Roman" w:hint="eastAsia"/>
+          <w:b/>
+          <w:bCs/>
+          <w:color w:val="000000"/>
+          <w:sz w:val="20"/>
+          <w:szCs w:val="20"/>
+        </w:rPr>
+        <w:t xml:space="preserve"> </w:t>
+      </w:r>
+      <w:r>
+        <w:rPr>
+          <w:rFonts w:ascii="Times New Roman" w:hAnsi="Times New Roman" w:cs="Times New Roman" w:hint="eastAsia"/>
+          <w:color w:val="000000"/>
+          <w:sz w:val="20"/>
+          <w:szCs w:val="20"/>
+        </w:rPr>
+        <w:t>(</w:t>
+      </w:r>
+      <w:r>
+        <w:rPr>
+          <w:rFonts w:ascii="Times New Roman" w:hAnsi="Times New Roman" w:cs="Times New Roman"/>
+          <w:b/>
+          <w:bCs/>
+          <w:color w:val="000000"/>
+          <w:sz w:val="20"/>
+          <w:szCs w:val="20"/>
+        </w:rPr>
+        <w:t>Supervisor</w:t>
+      </w:r>
+      <w:r>
+        <w:rPr>
+          <w:rFonts w:ascii="Times New Roman" w:hAnsi="Times New Roman" w:cs="Times New Roman"/>
+          <w:color w:val="000000"/>
+          <w:sz w:val="20"/>
+          <w:szCs w:val="20"/>
+        </w:rPr>
+        <w:t>:</w:t>
+      </w:r>
+      <w:r>
+        <w:rPr>
+          <w:rFonts w:ascii="Times New Roman" w:hAnsi="Times New Roman" w:cs="Times New Roman" w:hint="eastAsia"/>
+          <w:color w:val="000000"/>
+          <w:sz w:val="20"/>
+          <w:szCs w:val="20"/>
+        </w:rPr>
+        <w:t xml:space="preserve"> Dr.</w:t>
+      </w:r>
+      <w:r>
+        <w:rPr>
+          <w:rFonts w:ascii="Times New Roman" w:hAnsi="Times New Roman" w:cs="Times New Roman"/>
+          <w:color w:val="000000"/>
+          <w:sz w:val="20"/>
+          <w:szCs w:val="20"/>
+        </w:rPr>
+        <w:t xml:space="preserve"> Raheleh Jafari</w:t>
+      </w:r>
+      <w:r>
+        <w:rPr>
+          <w:rFonts w:ascii="Times New Roman" w:hAnsi="Times New Roman" w:cs="Times New Roman" w:hint="eastAsia"/>
+          <w:color w:val="000000"/>
+          <w:sz w:val="20"/>
+          <w:szCs w:val="20"/>
+        </w:rPr>
+        <w:t>)</w:t>
+      </w:r>
+      <w:r>
+        <w:rPr>
+          <w:rFonts w:ascii="Times New Roman" w:hAnsi="Times New Roman" w:cs="Times New Roman"/>
+          <w:b/>
+          <w:bCs/>
+          <w:color w:val="000000"/>
+          <w:sz w:val="20"/>
+          <w:szCs w:val="20"/>
+        </w:rPr>
+        <w:tab/>
+      </w:r>
+      <w:r>
+        <w:rPr>
+          <w:rFonts w:ascii="Times New Roman" w:hAnsi="Times New Roman" w:cs="Times New Roman"/>
+          <w:b/>
+          <w:bCs/>
+          <w:color w:val="000000"/>
+          <w:sz w:val="20"/>
+          <w:szCs w:val="20"/>
+        </w:rPr>
+        <w:tab/>
+      </w:r>
+      <w:r>
+        <w:rPr>
+          <w:rFonts w:ascii="Times New Roman" w:hAnsi="Times New Roman" w:cs="Times New Roman"/>
+          <w:b/>
+          <w:bCs/>
+          <w:color w:val="000000"/>
+          <w:sz w:val="20"/>
+          <w:szCs w:val="20"/>
+        </w:rPr>
+        <w:tab/>
+      </w:r>
+      <w:r>
+        <w:rPr>
+          <w:rFonts w:ascii="Times New Roman" w:hAnsi="Times New Roman" w:cs="Times New Roman"/>
+          <w:b/>
+          <w:bCs/>
+          <w:color w:val="000000"/>
+          <w:sz w:val="20"/>
+          <w:szCs w:val="20"/>
+        </w:rPr>
+        <w:tab/>
+      </w:r>
+      <w:r>
+        <w:rPr>
+          <w:rFonts w:ascii="Times New Roman" w:hAnsi="Times New Roman" w:cs="Times New Roman"/>
+          <w:b/>
+          <w:bCs/>
+          <w:color w:val="000000"/>
+          <w:sz w:val="20"/>
+          <w:szCs w:val="20"/>
+        </w:rPr>
+        <w:tab/>
+      </w:r>
+      <w:r>
+        <w:rPr>
+          <w:rFonts w:ascii="Times New Roman" w:hAnsi="Times New Roman" w:cs="Times New Roman"/>
+          <w:b/>
+          <w:bCs/>
+          <w:color w:val="000000"/>
+          <w:sz w:val="20"/>
+          <w:szCs w:val="20"/>
+        </w:rPr>
+        <w:tab/>
+      </w:r>
+      <w:r>
+        <w:rPr>
+          <w:rFonts w:ascii="Times New Roman" w:hAnsi="Times New Roman" w:cs="Times New Roman"/>
+          <w:b/>
+          <w:bCs/>
+          <w:color w:val="000000"/>
+          <w:sz w:val="20"/>
+          <w:szCs w:val="20"/>
+        </w:rPr>
+        <w:tab/>
+      </w:r>
+      <w:r>
+        <w:rPr>
+          <w:rFonts w:ascii="Times New Roman" w:hAnsi="Times New Roman" w:cs="Times New Roman"/>
+          <w:b/>
+          <w:bCs/>
+          <w:color w:val="000000"/>
+          <w:sz w:val="20"/>
+          <w:szCs w:val="20"/>
+        </w:rPr>
+        <w:tab/>
+      </w:r>
+      <w:r>
+        <w:rPr>
+          <w:rFonts w:ascii="Times New Roman" w:hAnsi="Times New Roman" w:cs="Times New Roman"/>
+          <w:b/>
+          <w:bCs/>
+          <w:color w:val="000000"/>
+          <w:sz w:val="20"/>
+          <w:szCs w:val="20"/>
+        </w:rPr>
+        <w:tab/>
+      </w:r>
+      <w:r>
+        <w:rPr>
+          <w:rFonts w:ascii="Times New Roman" w:hAnsi="Times New Roman" w:cs="Times New Roman" w:hint="eastAsia"/>
+          <w:b/>
+          <w:bCs/>
+          <w:color w:val="000000"/>
+          <w:sz w:val="20"/>
+          <w:szCs w:val="20"/>
+        </w:rPr>
+        <w:t xml:space="preserve">           </w:t>
+      </w:r>
+      <w:r>
+        <w:rPr>
+          <w:rFonts w:ascii="Times New Roman" w:hAnsi="Times New Roman" w:cs="Times New Roman"/>
+          <w:b/>
+          <w:bCs/>
+          <w:color w:val="000000"/>
+          <w:sz w:val="20"/>
+          <w:szCs w:val="20"/>
+        </w:rPr>
+        <w:t xml:space="preserve">Leeds, </w:t>
       </w:r>
       <w:r>
         <w:rPr>
@@ -3591,7 +4010,7 @@
         <w:ind w:leftChars="-250" w:left="-240" w:rightChars="-250" w:right="-600"/>
         <w:textAlignment w:val="baseline"/>
         <w:rPr>
-          <w:rFonts w:ascii="Times New Roman" w:hAnsi="Times New Roman" w:cs="Times New Roman" w:hint="eastAsia"/>
+          <w:rFonts w:ascii="Times New Roman" w:hAnsi="Times New Roman" w:cs="Times New Roman"/>
           <w:color w:val="000000"/>
           <w:sz w:val="20"/>
           <w:szCs w:val="20"/>
@@ -3649,63 +4068,7 @@
           <w:sz w:val="20"/>
           <w:szCs w:val="20"/>
         </w:rPr>
-        <w:t xml:space="preserve"> (</w:t>
-      </w:r>
-      <w:r>
-        <w:rPr>
-          <w:rFonts w:ascii="Times New Roman" w:hAnsi="Times New Roman" w:cs="Times New Roman"/>
-          <w:b/>
-          <w:bCs/>
-          <w:color w:val="000000"/>
-          <w:sz w:val="20"/>
-          <w:szCs w:val="20"/>
-        </w:rPr>
-        <w:t>Supervisor</w:t>
-      </w:r>
-      <w:r>
-        <w:rPr>
-          <w:rFonts w:ascii="Times New Roman" w:hAnsi="Times New Roman" w:cs="Times New Roman"/>
-          <w:color w:val="000000"/>
-          <w:sz w:val="20"/>
-          <w:szCs w:val="20"/>
-        </w:rPr>
-        <w:t>:</w:t>
-      </w:r>
-      <w:r>
-        <w:rPr>
-          <w:rFonts w:ascii="Times New Roman" w:hAnsi="Times New Roman" w:cs="Times New Roman" w:hint="eastAsia"/>
-          <w:color w:val="000000"/>
-          <w:sz w:val="20"/>
-          <w:szCs w:val="20"/>
-        </w:rPr>
-        <w:t xml:space="preserve"> Dr.</w:t>
-      </w:r>
-      <w:r>
-        <w:rPr>
-          <w:rFonts w:ascii="Times New Roman" w:hAnsi="Times New Roman" w:cs="Times New Roman"/>
-          <w:color w:val="000000"/>
-          <w:sz w:val="20"/>
-          <w:szCs w:val="20"/>
-        </w:rPr>
         <w:t xml:space="preserve"> </w:t>
-      </w:r>
-      <w:r>
-        <w:rPr>
-          <w:rFonts w:ascii="Times New Roman" w:hAnsi="Times New Roman" w:cs="Times New Roman"/>
-          <w:color w:val="000000"/>
-          <w:sz w:val="20"/>
-          <w:szCs w:val="20"/>
-        </w:rPr>
-        <w:t>Raheleh Jafari</w:t>
-      </w:r>
-      <w:r>
-        <w:rPr>
-          <w:rFonts w:ascii="Times New Roman" w:hAnsi="Times New Roman" w:cs="Times New Roman" w:hint="eastAsia"/>
-          <w:color w:val="000000"/>
-          <w:sz w:val="20"/>
-          <w:szCs w:val="20"/>
-        </w:rPr>
-        <w:t>)</w:t>
       </w:r>
     </w:p>
     <w:p>
@@ -3714,20 +4077,46 @@
         <w:spacing w:before="0" w:beforeAutospacing="0" w:after="0" w:afterAutospacing="0"/>
         <w:ind w:leftChars="-250" w:left="-600" w:rightChars="-250" w:right="-600"/>
         <w:rPr>
-          <w:sz w:val="20"/>
-          <w:szCs w:val="20"/>
-        </w:rPr>
-      </w:pPr>
-      <w:r>
-        <w:rPr>
-          <w:rFonts w:ascii="Times New Roman" w:hAnsi="Times New Roman" w:cs="Times New Roman"/>
-          <w:b/>
-          <w:bCs/>
-          <w:color w:val="000000"/>
-          <w:sz w:val="20"/>
-          <w:szCs w:val="20"/>
-        </w:rPr>
-        <w:t xml:space="preserve">AI Programmer | Internship                                    </w:t>
+          <w:rFonts w:ascii="Times New Roman" w:hAnsi="Times New Roman" w:cs="Times New Roman" w:hint="eastAsia"/>
+          <w:b/>
+          <w:bCs/>
+          <w:color w:val="000000"/>
+          <w:sz w:val="20"/>
+          <w:szCs w:val="20"/>
+        </w:rPr>
+      </w:pPr>
+      <w:r>
+        <w:rPr>
+          <w:rFonts w:ascii="Times New Roman" w:hAnsi="Times New Roman" w:cs="Times New Roman"/>
+          <w:b/>
+          <w:bCs/>
+          <w:color w:val="000000"/>
+          <w:sz w:val="20"/>
+          <w:szCs w:val="20"/>
+        </w:rPr>
+        <w:t>AI Programmer | Intern</w:t>
+      </w:r>
+      <w:r>
+        <w:rPr>
+          <w:rFonts w:ascii="Times New Roman" w:hAnsi="Times New Roman" w:cs="Times New Roman" w:hint="eastAsia"/>
+          <w:b/>
+          <w:bCs/>
+          <w:color w:val="000000"/>
+          <w:sz w:val="20"/>
+          <w:szCs w:val="20"/>
+        </w:rPr>
+        <w:t xml:space="preserve">     </w:t>
+      </w:r>
+      <w:r>
+        <w:rPr>
+          <w:rFonts w:ascii="Times New Roman" w:hAnsi="Times New Roman" w:cs="Times New Roman"/>
+          <w:b/>
+          <w:bCs/>
+          <w:color w:val="000000"/>
+          <w:sz w:val="20"/>
+          <w:szCs w:val="20"/>
+        </w:rPr>
+        <w:t xml:space="preserve">                                  </w:t>
       </w:r>
       <w:r>
         <w:rPr>
@@ -3794,18 +4183,73 @@
           <w:sz w:val="20"/>
           <w:szCs w:val="20"/>
         </w:rPr>
-        <w:t xml:space="preserve">          </w:t>
-      </w:r>
-      <w:r>
-        <w:rPr>
-          <w:rFonts w:ascii="Times New Roman" w:hAnsi="Times New Roman" w:cs="Times New Roman"/>
-          <w:b/>
-          <w:bCs/>
-          <w:color w:val="000000"/>
-          <w:sz w:val="20"/>
-          <w:szCs w:val="20"/>
-        </w:rPr>
-        <w:t>Jul.2020- Sep. 2020</w:t>
+        <w:t xml:space="preserve">    </w:t>
+      </w:r>
+      <w:r>
+        <w:rPr>
+          <w:rFonts w:ascii="Times New Roman" w:hAnsi="Times New Roman" w:cs="Times New Roman" w:hint="eastAsia"/>
+          <w:b/>
+          <w:bCs/>
+          <w:color w:val="000000"/>
+          <w:sz w:val="20"/>
+          <w:szCs w:val="20"/>
+        </w:rPr>
+        <w:t xml:space="preserve">     </w:t>
+      </w:r>
+      <w:r>
+        <w:rPr>
+          <w:rFonts w:ascii="Times New Roman" w:hAnsi="Times New Roman" w:cs="Times New Roman" w:hint="eastAsia"/>
+          <w:b/>
+          <w:bCs/>
+          <w:color w:val="000000"/>
+          <w:sz w:val="20"/>
+          <w:szCs w:val="20"/>
+        </w:rPr>
+        <w:t xml:space="preserve"> </w:t>
+      </w:r>
+      <w:r>
+        <w:rPr>
+          <w:rFonts w:ascii="Times New Roman" w:hAnsi="Times New Roman" w:cs="Times New Roman"/>
+          <w:b/>
+          <w:bCs/>
+          <w:color w:val="000000"/>
+          <w:sz w:val="20"/>
+          <w:szCs w:val="20"/>
+        </w:rPr>
+        <w:t>Jul.</w:t>
+      </w:r>
+      <w:r>
+        <w:rPr>
+          <w:rFonts w:ascii="Times New Roman" w:hAnsi="Times New Roman" w:cs="Times New Roman" w:hint="eastAsia"/>
+          <w:b/>
+          <w:bCs/>
+          <w:color w:val="000000"/>
+          <w:sz w:val="20"/>
+          <w:szCs w:val="20"/>
+        </w:rPr>
+        <w:t xml:space="preserve"> </w:t>
+      </w:r>
+      <w:r>
+        <w:rPr>
+          <w:rFonts w:ascii="Times New Roman" w:hAnsi="Times New Roman" w:cs="Times New Roman"/>
+          <w:b/>
+          <w:bCs/>
+          <w:color w:val="000000"/>
+          <w:sz w:val="20"/>
+          <w:szCs w:val="20"/>
+        </w:rPr>
+        <w:t>2020- Sep. 2</w:t>
+      </w:r>
+      <w:r>
+        <w:rPr>
+          <w:rFonts w:ascii="Times New Roman" w:hAnsi="Times New Roman" w:cs="Times New Roman" w:hint="eastAsia"/>
+          <w:b/>
+          <w:bCs/>
+          <w:color w:val="000000"/>
+          <w:sz w:val="20"/>
+          <w:szCs w:val="20"/>
+        </w:rPr>
+        <w:t>020</w:t>
       </w:r>
     </w:p>
     <w:p>
@@ -3831,174 +4275,181 @@
       </w:r>
       <w:r>
         <w:rPr>
-          <w:rStyle w:val="apple-tab-span"/>
-          <w:rFonts w:ascii="Times New Roman" w:hAnsi="Times New Roman" w:cs="Times New Roman"/>
-          <w:b/>
-          <w:bCs/>
-          <w:color w:val="000000"/>
-          <w:sz w:val="20"/>
-          <w:szCs w:val="20"/>
-        </w:rPr>
-        <w:tab/>
-      </w:r>
-      <w:r>
-        <w:rPr>
-          <w:rStyle w:val="apple-tab-span"/>
-          <w:rFonts w:ascii="Times New Roman" w:hAnsi="Times New Roman" w:cs="Times New Roman"/>
-          <w:b/>
-          <w:bCs/>
-          <w:color w:val="000000"/>
-          <w:sz w:val="20"/>
-          <w:szCs w:val="20"/>
-        </w:rPr>
-        <w:tab/>
-      </w:r>
-      <w:r>
-        <w:rPr>
-          <w:rStyle w:val="apple-tab-span"/>
-          <w:rFonts w:ascii="Times New Roman" w:hAnsi="Times New Roman" w:cs="Times New Roman"/>
-          <w:b/>
-          <w:bCs/>
-          <w:color w:val="000000"/>
-          <w:sz w:val="20"/>
-          <w:szCs w:val="20"/>
-        </w:rPr>
-        <w:tab/>
-      </w:r>
-      <w:r>
-        <w:rPr>
-          <w:rStyle w:val="apple-tab-span"/>
-          <w:rFonts w:ascii="Times New Roman" w:hAnsi="Times New Roman" w:cs="Times New Roman"/>
-          <w:b/>
-          <w:bCs/>
-          <w:color w:val="000000"/>
-          <w:sz w:val="20"/>
-          <w:szCs w:val="20"/>
-        </w:rPr>
-        <w:tab/>
-      </w:r>
-      <w:r>
-        <w:rPr>
-          <w:rStyle w:val="apple-tab-span"/>
-          <w:rFonts w:ascii="Times New Roman" w:hAnsi="Times New Roman" w:cs="Times New Roman"/>
-          <w:b/>
-          <w:bCs/>
-          <w:color w:val="000000"/>
-          <w:sz w:val="20"/>
-          <w:szCs w:val="20"/>
-        </w:rPr>
-        <w:tab/>
-      </w:r>
-      <w:r>
-        <w:rPr>
-          <w:rStyle w:val="apple-tab-span"/>
-          <w:rFonts w:ascii="Times New Roman" w:hAnsi="Times New Roman" w:cs="Times New Roman"/>
-          <w:b/>
-          <w:bCs/>
-          <w:color w:val="000000"/>
-          <w:sz w:val="20"/>
-          <w:szCs w:val="20"/>
-        </w:rPr>
-        <w:tab/>
-      </w:r>
-      <w:r>
-        <w:rPr>
-          <w:rStyle w:val="apple-tab-span"/>
-          <w:rFonts w:ascii="Times New Roman" w:hAnsi="Times New Roman" w:cs="Times New Roman"/>
-          <w:b/>
-          <w:bCs/>
-          <w:color w:val="000000"/>
-          <w:sz w:val="20"/>
-          <w:szCs w:val="20"/>
-        </w:rPr>
-        <w:tab/>
-      </w:r>
-      <w:r>
-        <w:rPr>
-          <w:rStyle w:val="apple-tab-span"/>
-          <w:rFonts w:ascii="Times New Roman" w:hAnsi="Times New Roman" w:cs="Times New Roman"/>
-          <w:b/>
-          <w:bCs/>
-          <w:color w:val="000000"/>
-          <w:sz w:val="20"/>
-          <w:szCs w:val="20"/>
-        </w:rPr>
-        <w:tab/>
-      </w:r>
-      <w:r>
-        <w:rPr>
-          <w:rStyle w:val="apple-tab-span"/>
-          <w:rFonts w:ascii="Times New Roman" w:hAnsi="Times New Roman" w:cs="Times New Roman"/>
-          <w:b/>
-          <w:bCs/>
-          <w:color w:val="000000"/>
-          <w:sz w:val="20"/>
-          <w:szCs w:val="20"/>
-        </w:rPr>
-        <w:tab/>
-      </w:r>
-      <w:r>
-        <w:rPr>
-          <w:rStyle w:val="apple-tab-span"/>
-          <w:rFonts w:ascii="Times New Roman" w:hAnsi="Times New Roman" w:cs="Times New Roman"/>
-          <w:b/>
-          <w:bCs/>
-          <w:color w:val="000000"/>
-          <w:sz w:val="20"/>
-          <w:szCs w:val="20"/>
-        </w:rPr>
-        <w:tab/>
-      </w:r>
-      <w:r>
-        <w:rPr>
-          <w:rStyle w:val="apple-tab-span"/>
-          <w:rFonts w:ascii="Times New Roman" w:hAnsi="Times New Roman" w:cs="Times New Roman"/>
-          <w:b/>
-          <w:bCs/>
-          <w:color w:val="000000"/>
-          <w:sz w:val="20"/>
-          <w:szCs w:val="20"/>
-        </w:rPr>
-        <w:tab/>
-      </w:r>
-      <w:r>
-        <w:rPr>
-          <w:rFonts w:ascii="Times New Roman" w:hAnsi="Times New Roman" w:cs="Times New Roman"/>
-          <w:b/>
-          <w:bCs/>
-          <w:color w:val="000000"/>
-          <w:sz w:val="20"/>
-          <w:szCs w:val="20"/>
-        </w:rPr>
-        <w:t xml:space="preserve">                        </w:t>
-      </w:r>
-      <w:r>
-        <w:rPr>
-          <w:rFonts w:ascii="Times New Roman" w:hAnsi="Times New Roman" w:cs="Times New Roman"/>
-          <w:b/>
-          <w:bCs/>
-          <w:color w:val="000000"/>
-          <w:sz w:val="20"/>
-          <w:szCs w:val="20"/>
-        </w:rPr>
-        <w:t xml:space="preserve">          </w:t>
-      </w:r>
-      <w:r>
-        <w:rPr>
-          <w:rFonts w:ascii="Times New Roman" w:hAnsi="Times New Roman" w:cs="Times New Roman" w:hint="eastAsia"/>
-          <w:b/>
-          <w:bCs/>
-          <w:color w:val="000000"/>
-          <w:sz w:val="20"/>
-          <w:szCs w:val="20"/>
-        </w:rPr>
-        <w:t xml:space="preserve"> </w:t>
-      </w:r>
-      <w:r>
-        <w:rPr>
-          <w:rFonts w:ascii="Times New Roman" w:hAnsi="Times New Roman" w:cs="Times New Roman" w:hint="eastAsia"/>
-          <w:b/>
-          <w:bCs/>
+          <w:rFonts w:ascii="Times New Roman" w:hAnsi="Times New Roman" w:cs="Times New Roman" w:hint="eastAsia"/>
+          <w:color w:val="000000"/>
+          <w:sz w:val="20"/>
+          <w:szCs w:val="20"/>
+        </w:rPr>
+        <w:t>(</w:t>
+      </w:r>
+      <w:r>
+        <w:rPr>
+          <w:rFonts w:ascii="Times New Roman" w:hAnsi="Times New Roman" w:cs="Times New Roman"/>
+          <w:b/>
+          <w:bCs/>
+          <w:color w:val="000000"/>
+          <w:sz w:val="20"/>
+          <w:szCs w:val="20"/>
+        </w:rPr>
+        <w:t>Supervisor</w:t>
+      </w:r>
+      <w:r>
+        <w:rPr>
+          <w:rFonts w:ascii="Times New Roman" w:hAnsi="Times New Roman" w:cs="Times New Roman"/>
+          <w:color w:val="000000"/>
+          <w:sz w:val="20"/>
+          <w:szCs w:val="20"/>
+        </w:rPr>
+        <w:t>:</w:t>
+      </w:r>
+      <w:r>
+        <w:rPr>
+          <w:rFonts w:ascii="Times New Roman" w:hAnsi="Times New Roman" w:cs="Times New Roman" w:hint="eastAsia"/>
+          <w:color w:val="000000"/>
+          <w:sz w:val="20"/>
+          <w:szCs w:val="20"/>
+        </w:rPr>
+        <w:t xml:space="preserve"> Dr. Wenbin Cai</w:t>
+      </w:r>
+      <w:r>
+        <w:rPr>
+          <w:rFonts w:ascii="Times New Roman" w:hAnsi="Times New Roman" w:cs="Times New Roman" w:hint="eastAsia"/>
+          <w:color w:val="000000"/>
+          <w:sz w:val="20"/>
+          <w:szCs w:val="20"/>
+        </w:rPr>
+        <w:t>)</w:t>
+      </w:r>
+      <w:r>
+        <w:rPr>
+          <w:rFonts w:ascii="Times New Roman" w:hAnsi="Times New Roman" w:cs="Times New Roman"/>
+          <w:color w:val="000000"/>
+          <w:sz w:val="20"/>
+          <w:szCs w:val="20"/>
+        </w:rPr>
+        <w:tab/>
+      </w:r>
+      <w:r>
+        <w:rPr>
+          <w:rFonts w:ascii="Times New Roman" w:hAnsi="Times New Roman" w:cs="Times New Roman"/>
+          <w:color w:val="000000"/>
+          <w:sz w:val="20"/>
+          <w:szCs w:val="20"/>
+        </w:rPr>
+        <w:tab/>
+      </w:r>
+      <w:r>
+        <w:rPr>
+          <w:rFonts w:ascii="Times New Roman" w:hAnsi="Times New Roman" w:cs="Times New Roman"/>
+          <w:color w:val="000000"/>
+          <w:sz w:val="20"/>
+          <w:szCs w:val="20"/>
+        </w:rPr>
+        <w:tab/>
+      </w:r>
+      <w:r>
+        <w:rPr>
+          <w:rFonts w:ascii="Times New Roman" w:hAnsi="Times New Roman" w:cs="Times New Roman"/>
+          <w:color w:val="000000"/>
+          <w:sz w:val="20"/>
+          <w:szCs w:val="20"/>
+        </w:rPr>
+        <w:tab/>
+      </w:r>
+      <w:r>
+        <w:rPr>
+          <w:rFonts w:ascii="Times New Roman" w:hAnsi="Times New Roman" w:cs="Times New Roman"/>
+          <w:color w:val="000000"/>
+          <w:sz w:val="20"/>
+          <w:szCs w:val="20"/>
+        </w:rPr>
+        <w:tab/>
+      </w:r>
+      <w:r>
+        <w:rPr>
+          <w:rFonts w:ascii="Times New Roman" w:hAnsi="Times New Roman" w:cs="Times New Roman"/>
+          <w:color w:val="000000"/>
+          <w:sz w:val="20"/>
+          <w:szCs w:val="20"/>
+        </w:rPr>
+        <w:tab/>
+      </w:r>
+      <w:r>
+        <w:rPr>
+          <w:rFonts w:ascii="Times New Roman" w:hAnsi="Times New Roman" w:cs="Times New Roman"/>
+          <w:color w:val="000000"/>
+          <w:sz w:val="20"/>
+          <w:szCs w:val="20"/>
+        </w:rPr>
+        <w:tab/>
+      </w:r>
+      <w:r>
+        <w:rPr>
+          <w:rFonts w:ascii="Times New Roman" w:hAnsi="Times New Roman" w:cs="Times New Roman"/>
+          <w:color w:val="000000"/>
+          <w:sz w:val="20"/>
+          <w:szCs w:val="20"/>
+        </w:rPr>
+        <w:tab/>
+      </w:r>
+      <w:r>
+        <w:rPr>
+          <w:rFonts w:ascii="Times New Roman" w:hAnsi="Times New Roman" w:cs="Times New Roman"/>
+          <w:color w:val="000000"/>
+          <w:sz w:val="20"/>
+          <w:szCs w:val="20"/>
+        </w:rPr>
+        <w:tab/>
+      </w:r>
+      <w:r>
+        <w:rPr>
+          <w:rFonts w:ascii="Times New Roman" w:hAnsi="Times New Roman" w:cs="Times New Roman"/>
+          <w:color w:val="000000"/>
+          <w:sz w:val="20"/>
+          <w:szCs w:val="20"/>
+        </w:rPr>
+        <w:tab/>
+      </w:r>
+      <w:r>
+        <w:rPr>
+          <w:rFonts w:ascii="Times New Roman" w:hAnsi="Times New Roman" w:cs="Times New Roman"/>
+          <w:color w:val="000000"/>
+          <w:sz w:val="20"/>
+          <w:szCs w:val="20"/>
+        </w:rPr>
+        <w:tab/>
+      </w:r>
+      <w:r>
+        <w:rPr>
+          <w:rFonts w:ascii="Times New Roman" w:hAnsi="Times New Roman" w:cs="Times New Roman"/>
+          <w:color w:val="000000"/>
+          <w:sz w:val="20"/>
+          <w:szCs w:val="20"/>
+        </w:rPr>
+        <w:tab/>
+      </w:r>
+      <w:r>
+        <w:rPr>
+          <w:rFonts w:ascii="Times New Roman" w:hAnsi="Times New Roman" w:cs="Times New Roman"/>
+          <w:color w:val="000000"/>
+          <w:sz w:val="20"/>
+          <w:szCs w:val="20"/>
+        </w:rPr>
+        <w:tab/>
+      </w:r>
+      <w:proofErr w:type="gramStart"/>
+      <w:r>
+        <w:rPr>
+          <w:rFonts w:ascii="Times New Roman" w:hAnsi="Times New Roman" w:cs="Times New Roman"/>
+          <w:color w:val="000000"/>
+          <w:sz w:val="20"/>
+          <w:szCs w:val="20"/>
+        </w:rPr>
+        <w:tab/>
+      </w:r>
+      <w:r>
+        <w:rPr>
+          <w:rFonts w:ascii="Times New Roman" w:hAnsi="Times New Roman" w:cs="Times New Roman" w:hint="eastAsia"/>
           <w:color w:val="000000"/>
           <w:sz w:val="20"/>
           <w:szCs w:val="20"/>
@@ -4014,7 +4465,19 @@
           <w:sz w:val="20"/>
           <w:szCs w:val="20"/>
         </w:rPr>
-        <w:t>Beijing, C</w:t>
+        <w:t>Beijing</w:t>
+      </w:r>
+      <w:proofErr w:type="gramEnd"/>
+      <w:r>
+        <w:rPr>
+          <w:rFonts w:ascii="Times New Roman" w:hAnsi="Times New Roman" w:cs="Times New Roman"/>
+          <w:b/>
+          <w:bCs/>
+          <w:color w:val="000000"/>
+          <w:sz w:val="20"/>
+          <w:szCs w:val="20"/>
+        </w:rPr>
+        <w:t>, C</w:t>
       </w:r>
       <w:r>
         <w:rPr>
@@ -4053,134 +4516,6 @@
           <w:szCs w:val="20"/>
         </w:rPr>
         <w:t xml:space="preserve">Developed a universal web crawler to scrape daily news, simulating search engine behavior for an online news-feeding application. </w:t>
-      </w:r>
-    </w:p>
-    <w:p>
-      <w:pPr>
-        <w:pStyle w:val="ad"/>
-        <w:numPr>
-          <w:ilvl w:val="0"/>
-          <w:numId w:val="6"/>
-        </w:numPr>
-        <w:spacing w:before="0" w:beforeAutospacing="0" w:after="0" w:afterAutospacing="0"/>
-        <w:ind w:leftChars="-250" w:left="-240" w:rightChars="-250" w:right="-600"/>
-        <w:textAlignment w:val="baseline"/>
-        <w:rPr>
-          <w:rFonts w:ascii="Times New Roman" w:hAnsi="Times New Roman" w:cs="Times New Roman" w:hint="eastAsia"/>
-          <w:color w:val="000000"/>
-          <w:sz w:val="20"/>
-          <w:szCs w:val="20"/>
-        </w:rPr>
-      </w:pPr>
-      <w:r>
-        <w:rPr>
-          <w:rFonts w:ascii="Times New Roman" w:hAnsi="Times New Roman" w:cs="Times New Roman"/>
-          <w:color w:val="000000"/>
-          <w:sz w:val="20"/>
-          <w:szCs w:val="20"/>
-        </w:rPr>
-        <w:t xml:space="preserve">Analyzed large datasets to enhance user experience and information delivery. Achieved over 90% accuracy in classifying </w:t>
-      </w:r>
-      <w:r>
-        <w:rPr>
-          <w:rFonts w:ascii="Times New Roman" w:hAnsi="Times New Roman" w:cs="Times New Roman" w:hint="eastAsia"/>
-          <w:color w:val="000000"/>
-          <w:sz w:val="20"/>
-          <w:szCs w:val="20"/>
-        </w:rPr>
-        <w:t>mul</w:t>
-      </w:r>
-      <w:r>
-        <w:rPr>
-          <w:rFonts w:ascii="Times New Roman" w:hAnsi="Times New Roman" w:cs="Times New Roman" w:hint="eastAsia"/>
-          <w:color w:val="000000"/>
-          <w:sz w:val="20"/>
-          <w:szCs w:val="20"/>
-        </w:rPr>
-        <w:t>t</w:t>
-      </w:r>
-      <w:r>
-        <w:rPr>
-          <w:rFonts w:ascii="Times New Roman" w:hAnsi="Times New Roman" w:cs="Times New Roman" w:hint="eastAsia"/>
-          <w:color w:val="000000"/>
-          <w:sz w:val="20"/>
-          <w:szCs w:val="20"/>
-        </w:rPr>
-        <w:t xml:space="preserve">i-topics </w:t>
-      </w:r>
-      <w:r>
-        <w:rPr>
-          <w:rFonts w:ascii="Times New Roman" w:hAnsi="Times New Roman" w:cs="Times New Roman"/>
-          <w:color w:val="000000"/>
-          <w:sz w:val="20"/>
-          <w:szCs w:val="20"/>
-        </w:rPr>
-        <w:t>news</w:t>
-      </w:r>
-      <w:r>
-        <w:rPr>
-          <w:rFonts w:ascii="Times New Roman" w:hAnsi="Times New Roman" w:cs="Times New Roman" w:hint="eastAsia"/>
-          <w:color w:val="000000"/>
-          <w:sz w:val="20"/>
-          <w:szCs w:val="20"/>
-        </w:rPr>
-        <w:t xml:space="preserve"> </w:t>
-      </w:r>
-      <w:r>
-        <w:rPr>
-          <w:rFonts w:ascii="Times New Roman" w:hAnsi="Times New Roman" w:cs="Times New Roman"/>
-          <w:color w:val="000000"/>
-          <w:sz w:val="20"/>
-          <w:szCs w:val="20"/>
-        </w:rPr>
-        <w:t>using an LSTM model.</w:t>
-      </w:r>
-      <w:r>
-        <w:rPr>
-          <w:rFonts w:ascii="Times New Roman" w:hAnsi="Times New Roman" w:cs="Times New Roman" w:hint="eastAsia"/>
-          <w:color w:val="000000"/>
-          <w:sz w:val="20"/>
-          <w:szCs w:val="20"/>
-        </w:rPr>
-        <w:t xml:space="preserve"> (</w:t>
-      </w:r>
-      <w:r>
-        <w:rPr>
-          <w:rFonts w:ascii="Times New Roman" w:hAnsi="Times New Roman" w:cs="Times New Roman"/>
-          <w:b/>
-          <w:bCs/>
-          <w:color w:val="000000"/>
-          <w:sz w:val="20"/>
-          <w:szCs w:val="20"/>
-        </w:rPr>
-        <w:t>Supervisor</w:t>
-      </w:r>
-      <w:r>
-        <w:rPr>
-          <w:rFonts w:ascii="Times New Roman" w:hAnsi="Times New Roman" w:cs="Times New Roman"/>
-          <w:color w:val="000000"/>
-          <w:sz w:val="20"/>
-          <w:szCs w:val="20"/>
-        </w:rPr>
-        <w:t>:</w:t>
-      </w:r>
-      <w:r>
-        <w:rPr>
-          <w:rFonts w:ascii="Times New Roman" w:hAnsi="Times New Roman" w:cs="Times New Roman" w:hint="eastAsia"/>
-          <w:color w:val="000000"/>
-          <w:sz w:val="20"/>
-          <w:szCs w:val="20"/>
-        </w:rPr>
-        <w:t xml:space="preserve"> Dr. Wenbin Cai</w:t>
-      </w:r>
-      <w:r>
-        <w:rPr>
-          <w:rFonts w:ascii="Times New Roman" w:hAnsi="Times New Roman" w:cs="Times New Roman" w:hint="eastAsia"/>
-          <w:color w:val="000000"/>
-          <w:sz w:val="20"/>
-          <w:szCs w:val="20"/>
-        </w:rPr>
-        <w:t>)</w:t>
       </w:r>
     </w:p>
     <w:p>
@@ -4533,25 +4868,7 @@
             <w:sz w:val="20"/>
             <w:szCs w:val="20"/>
           </w:rPr>
-          <w:t>W</w:t>
-        </w:r>
-        <w:r>
-          <w:rPr>
-            <w:rStyle w:val="a5"/>
-            <w:rFonts w:ascii="Times New Roman" w:hAnsi="Times New Roman" w:cs="Times New Roman" w:hint="eastAsia"/>
-            <w:sz w:val="20"/>
-            <w:szCs w:val="20"/>
-          </w:rPr>
-          <w:t>e</w:t>
-        </w:r>
-        <w:r>
-          <w:rPr>
-            <w:rStyle w:val="a5"/>
-            <w:rFonts w:ascii="Times New Roman" w:hAnsi="Times New Roman" w:cs="Times New Roman" w:hint="eastAsia"/>
-            <w:sz w:val="20"/>
-            <w:szCs w:val="20"/>
-          </w:rPr>
-          <w:t>b</w:t>
+          <w:t>Web</w:t>
         </w:r>
       </w:hyperlink>
       <w:r>
@@ -4735,16 +5052,7 @@
             <w:sz w:val="20"/>
             <w:szCs w:val="20"/>
           </w:rPr>
-          <w:t>We</w:t>
-        </w:r>
-        <w:r>
-          <w:rPr>
-            <w:rStyle w:val="a5"/>
-            <w:rFonts w:ascii="Times New Roman" w:hAnsi="Times New Roman" w:cs="Times New Roman" w:hint="eastAsia"/>
-            <w:sz w:val="20"/>
-            <w:szCs w:val="20"/>
-          </w:rPr>
-          <w:t>b</w:t>
+          <w:t>Web</w:t>
         </w:r>
       </w:hyperlink>
       <w:r>
@@ -4847,7 +5155,6 @@
         <w:jc w:val="both"/>
         <w:rPr>
           <w:rStyle w:val="None"/>
-          <w:rFonts w:hint="eastAsia"/>
           <w:sz w:val="21"/>
           <w:szCs w:val="21"/>
         </w:rPr>
@@ -4993,7 +5300,7 @@
 </file>
 
 <file path=word/endnotes.xml><?xml version="1.0" encoding="utf-8"?>
-<w:endnotes xmlns:wpc="http://schemas.microsoft.com/office/word/2010/wordprocessingCanvas" xmlns:cx="http://schemas.microsoft.com/office/drawing/2014/chartex" xmlns:cx1="http://schemas.microsoft.com/office/drawing/2015/9/8/chartex" xmlns:cx2="http://schemas.microsoft.com/office/drawing/2015/10/21/chartex" xmlns:cx3="http://schemas.microsoft.com/office/drawing/2016/5/9/chartex" xmlns:cx4="http://schemas.microsoft.com/office/drawing/2016/5/10/chartex" xmlns:cx5="http://schemas.microsoft.com/office/drawing/2016/5/11/chartex" xmlns:cx6="http://schemas.microsoft.com/office/drawing/2016/5/12/chartex" xmlns:cx7="http://schemas.microsoft.com/office/drawing/2016/5/13/chartex" xmlns:cx8="http://schemas.microsoft.com/office/drawing/2016/5/14/chartex" xmlns:mc="http://schemas.openxmlformats.org/markup-compatibility/2006" xmlns:aink="http://schemas.microsoft.com/office/drawing/2016/ink" xmlns:am3d="http://schemas.microsoft.com/office/drawing/2017/model3d" xmlns:o="urn:schemas-microsoft-com:office:office" xmlns:oel="http://schemas.microsoft.com/office/2019/extlst" xmlns:r="http://schemas.openxmlformats.org/officeDocument/2006/relationships" xmlns:m="http://schemas.openxmlformats.org/officeDocument/2006/math" xmlns:v="urn:schemas-microsoft-com:vml" xmlns:wp14="http://schemas.microsoft.com/office/word/2010/wordprocessingDrawing" xmlns:wp="http://schemas.openxmlformats.org/drawingml/2006/wordprocessingDrawing" xmlns:w10="urn:schemas-microsoft-com:office:word" xmlns:w="http://schemas.openxmlformats.org/wordprocessingml/2006/main" xmlns:w14="http://schemas.microsoft.com/office/word/2010/wordml" xmlns:w15="http://schemas.microsoft.com/office/word/2012/wordml" xmlns:w16cex="http://schemas.microsoft.com/office/word/2018/wordml/cex" xmlns:w16cid="http://schemas.microsoft.com/office/word/2016/wordml/cid" xmlns:w16="http://schemas.microsoft.com/office/word/2018/wordml" xmlns:w16du="http://schemas.microsoft.com/office/word/2023/wordml/word16du" xmlns:w16sdtdh="http://schemas.microsoft.com/office/word/2020/wordml/sdtdatahash" xmlns:w16se="http://schemas.microsoft.com/office/word/2015/wordml/symex" xmlns:wpg="http://schemas.microsoft.com/office/word/2010/wordprocessingGroup" xmlns:wpi="http://schemas.microsoft.com/office/word/2010/wordprocessingInk" xmlns:wne="http://schemas.microsoft.com/office/word/2006/wordml" xmlns:wps="http://schemas.microsoft.com/office/word/2010/wordprocessingShape" mc:Ignorable="w14 w15 w16se w16cid w16 w16cex w16sdtdh w16du wp14">
+<w:endnotes xmlns:wpc="http://schemas.microsoft.com/office/word/2010/wordprocessingCanvas" xmlns:cx="http://schemas.microsoft.com/office/drawing/2014/chartex" xmlns:cx1="http://schemas.microsoft.com/office/drawing/2015/9/8/chartex" xmlns:cx2="http://schemas.microsoft.com/office/drawing/2015/10/21/chartex" xmlns:cx3="http://schemas.microsoft.com/office/drawing/2016/5/9/chartex" xmlns:cx4="http://schemas.microsoft.com/office/drawing/2016/5/10/chartex" xmlns:cx5="http://schemas.microsoft.com/office/drawing/2016/5/11/chartex" xmlns:cx6="http://schemas.microsoft.com/office/drawing/2016/5/12/chartex" xmlns:cx7="http://schemas.microsoft.com/office/drawing/2016/5/13/chartex" xmlns:cx8="http://schemas.microsoft.com/office/drawing/2016/5/14/chartex" xmlns:mc="http://schemas.openxmlformats.org/markup-compatibility/2006" xmlns:aink="http://schemas.microsoft.com/office/drawing/2016/ink" xmlns:am3d="http://schemas.microsoft.com/office/drawing/2017/model3d" xmlns:o="urn:schemas-microsoft-com:office:office" xmlns:oel="http://schemas.microsoft.com/office/2019/extlst" xmlns:r="http://schemas.openxmlformats.org/officeDocument/2006/relationships" xmlns:m="http://schemas.openxmlformats.org/officeDocument/2006/math" xmlns:v="urn:schemas-microsoft-com:vml" xmlns:wp14="http://schemas.microsoft.com/office/word/2010/wordprocessingDrawing" xmlns:wp="http://schemas.openxmlformats.org/drawingml/2006/wordprocessingDrawing" xmlns:w10="urn:schemas-microsoft-com:office:word" xmlns:w="http://schemas.openxmlformats.org/wordprocessingml/2006/main" xmlns:w14="http://schemas.microsoft.com/office/word/2010/wordml" xmlns:w15="http://schemas.microsoft.com/office/word/2012/wordml" xmlns:w16cex="http://schemas.microsoft.com/office/word/2018/wordml/cex" xmlns:w16cid="http://schemas.microsoft.com/office/word/2016/wordml/cid" xmlns:w16="http://schemas.microsoft.com/office/word/2018/wordml" xmlns:w16du="http://schemas.microsoft.com/office/word/2023/wordml/word16du" xmlns:w16sdtdh="http://schemas.microsoft.com/office/word/2020/wordml/sdtdatahash" xmlns:w16sdtfl="http://schemas.microsoft.com/office/word/2024/wordml/sdtformatlock" xmlns:w16se="http://schemas.microsoft.com/office/word/2015/wordml/symex" xmlns:wpg="http://schemas.microsoft.com/office/word/2010/wordprocessingGroup" xmlns:wpi="http://schemas.microsoft.com/office/word/2010/wordprocessingInk" xmlns:wne="http://schemas.microsoft.com/office/word/2006/wordml" xmlns:wps="http://schemas.microsoft.com/office/word/2010/wordprocessingShape" mc:Ignorable="w14 w15 w16se w16cid w16 w16cex w16sdtdh w16sdtfl w16du wp14">
   <w:endnote w:type="separator" w:id="-1">
     <w:p>
       <w:r>
@@ -5012,7 +5319,7 @@
 </file>
 
 <file path=word/footnotes.xml><?xml version="1.0" encoding="utf-8"?>
-<w:footnotes xmlns:wpc="http://schemas.microsoft.com/office/word/2010/wordprocessingCanvas" xmlns:cx="http://schemas.microsoft.com/office/drawing/2014/chartex" xmlns:cx1="http://schemas.microsoft.com/office/drawing/2015/9/8/chartex" xmlns:cx2="http://schemas.microsoft.com/office/drawing/2015/10/21/chartex" xmlns:cx3="http://schemas.microsoft.com/office/drawing/2016/5/9/chartex" xmlns:cx4="http://schemas.microsoft.com/office/drawing/2016/5/10/chartex" xmlns:cx5="http://schemas.microsoft.com/office/drawing/2016/5/11/chartex" xmlns:cx6="http://schemas.microsoft.com/office/drawing/2016/5/12/chartex" xmlns:cx7="http://schemas.microsoft.com/office/drawing/2016/5/13/chartex" xmlns:cx8="http://schemas.microsoft.com/office/drawing/2016/5/14/chartex" xmlns:mc="http://schemas.openxmlformats.org/markup-compatibility/2006" xmlns:aink="http://schemas.microsoft.com/office/drawing/2016/ink" xmlns:am3d="http://schemas.microsoft.com/office/drawing/2017/model3d" xmlns:o="urn:schemas-microsoft-com:office:office" xmlns:oel="http://schemas.microsoft.com/office/2019/extlst" xmlns:r="http://schemas.openxmlformats.org/officeDocument/2006/relationships" xmlns:m="http://schemas.openxmlformats.org/officeDocument/2006/math" xmlns:v="urn:schemas-microsoft-com:vml" xmlns:wp14="http://schemas.microsoft.com/office/word/2010/wordprocessingDrawing" xmlns:wp="http://schemas.openxmlformats.org/drawingml/2006/wordprocessingDrawing" xmlns:w10="urn:schemas-microsoft-com:office:word" xmlns:w="http://schemas.openxmlformats.org/wordprocessingml/2006/main" xmlns:w14="http://schemas.microsoft.com/office/word/2010/wordml" xmlns:w15="http://schemas.microsoft.com/office/word/2012/wordml" xmlns:w16cex="http://schemas.microsoft.com/office/word/2018/wordml/cex" xmlns:w16cid="http://schemas.microsoft.com/office/word/2016/wordml/cid" xmlns:w16="http://schemas.microsoft.com/office/word/2018/wordml" xmlns:w16du="http://schemas.microsoft.com/office/word/2023/wordml/word16du" xmlns:w16sdtdh="http://schemas.microsoft.com/office/word/2020/wordml/sdtdatahash" xmlns:w16se="http://schemas.microsoft.com/office/word/2015/wordml/symex" xmlns:wpg="http://schemas.microsoft.com/office/word/2010/wordprocessingGroup" xmlns:wpi="http://schemas.microsoft.com/office/word/2010/wordprocessingInk" xmlns:wne="http://schemas.microsoft.com/office/word/2006/wordml" xmlns:wps="http://schemas.microsoft.com/office/word/2010/wordprocessingShape" mc:Ignorable="w14 w15 w16se w16cid w16 w16cex w16sdtdh w16du wp14">
+<w:footnotes xmlns:wpc="http://schemas.microsoft.com/office/word/2010/wordprocessingCanvas" xmlns:cx="http://schemas.microsoft.com/office/drawing/2014/chartex" xmlns:cx1="http://schemas.microsoft.com/office/drawing/2015/9/8/chartex" xmlns:cx2="http://schemas.microsoft.com/office/drawing/2015/10/21/chartex" xmlns:cx3="http://schemas.microsoft.com/office/drawing/2016/5/9/chartex" xmlns:cx4="http://schemas.microsoft.com/office/drawing/2016/5/10/chartex" xmlns:cx5="http://schemas.microsoft.com/office/drawing/2016/5/11/chartex" xmlns:cx6="http://schemas.microsoft.com/office/drawing/2016/5/12/chartex" xmlns:cx7="http://schemas.microsoft.com/office/drawing/2016/5/13/chartex" xmlns:cx8="http://schemas.microsoft.com/office/drawing/2016/5/14/chartex" xmlns:mc="http://schemas.openxmlformats.org/markup-compatibility/2006" xmlns:aink="http://schemas.microsoft.com/office/drawing/2016/ink" xmlns:am3d="http://schemas.microsoft.com/office/drawing/2017/model3d" xmlns:o="urn:schemas-microsoft-com:office:office" xmlns:oel="http://schemas.microsoft.com/office/2019/extlst" xmlns:r="http://schemas.openxmlformats.org/officeDocument/2006/relationships" xmlns:m="http://schemas.openxmlformats.org/officeDocument/2006/math" xmlns:v="urn:schemas-microsoft-com:vml" xmlns:wp14="http://schemas.microsoft.com/office/word/2010/wordprocessingDrawing" xmlns:wp="http://schemas.openxmlformats.org/drawingml/2006/wordprocessingDrawing" xmlns:w10="urn:schemas-microsoft-com:office:word" xmlns:w="http://schemas.openxmlformats.org/wordprocessingml/2006/main" xmlns:w14="http://schemas.microsoft.com/office/word/2010/wordml" xmlns:w15="http://schemas.microsoft.com/office/word/2012/wordml" xmlns:w16cex="http://schemas.microsoft.com/office/word/2018/wordml/cex" xmlns:w16cid="http://schemas.microsoft.com/office/word/2016/wordml/cid" xmlns:w16="http://schemas.microsoft.com/office/word/2018/wordml" xmlns:w16du="http://schemas.microsoft.com/office/word/2023/wordml/word16du" xmlns:w16sdtdh="http://schemas.microsoft.com/office/word/2020/wordml/sdtdatahash" xmlns:w16sdtfl="http://schemas.microsoft.com/office/word/2024/wordml/sdtformatlock" xmlns:w16se="http://schemas.microsoft.com/office/word/2015/wordml/symex" xmlns:wpg="http://schemas.microsoft.com/office/word/2010/wordprocessingGroup" xmlns:wpi="http://schemas.microsoft.com/office/word/2010/wordprocessingInk" xmlns:wne="http://schemas.microsoft.com/office/word/2006/wordml" xmlns:wps="http://schemas.microsoft.com/office/word/2010/wordprocessingShape" mc:Ignorable="w14 w15 w16se w16cid w16 w16cex w16sdtdh w16sdtfl w16du wp14">
   <w:footnote w:type="separator" w:id="-1">
     <w:p>
       <w:r>
@@ -5031,7 +5338,7 @@
 </file>
 
 <file path=word/numbering.xml><?xml version="1.0" encoding="utf-8"?>
-<w:numbering xmlns:wpc="http://schemas.microsoft.com/office/word/2010/wordprocessingCanvas" xmlns:cx="http://schemas.microsoft.com/office/drawing/2014/chartex" xmlns:cx1="http://schemas.microsoft.com/office/drawing/2015/9/8/chartex" xmlns:cx2="http://schemas.microsoft.com/office/drawing/2015/10/21/chartex" xmlns:cx3="http://schemas.microsoft.com/office/drawing/2016/5/9/chartex" xmlns:cx4="http://schemas.microsoft.com/office/drawing/2016/5/10/chartex" xmlns:cx5="http://schemas.microsoft.com/office/drawing/2016/5/11/chartex" xmlns:cx6="http://schemas.microsoft.com/office/drawing/2016/5/12/chartex" xmlns:cx7="http://schemas.microsoft.com/office/drawing/2016/5/13/chartex" xmlns:cx8="http://schemas.microsoft.com/office/drawing/2016/5/14/chartex" xmlns:mc="http://schemas.openxmlformats.org/markup-compatibility/2006" xmlns:aink="http://schemas.microsoft.com/office/drawing/2016/ink" xmlns:am3d="http://schemas.microsoft.com/office/drawing/2017/model3d" xmlns:o="urn:schemas-microsoft-com:office:office" xmlns:oel="http://schemas.microsoft.com/office/2019/extlst" xmlns:r="http://schemas.openxmlformats.org/officeDocument/2006/relationships" xmlns:m="http://schemas.openxmlformats.org/officeDocument/2006/math" xmlns:v="urn:schemas-microsoft-com:vml" xmlns:wp14="http://schemas.microsoft.com/office/word/2010/wordprocessingDrawing" xmlns:wp="http://schemas.openxmlformats.org/drawingml/2006/wordprocessingDrawing" xmlns:w10="urn:schemas-microsoft-com:office:word" xmlns:w="http://schemas.openxmlformats.org/wordprocessingml/2006/main" xmlns:w14="http://schemas.microsoft.com/office/word/2010/wordml" xmlns:w15="http://schemas.microsoft.com/office/word/2012/wordml" xmlns:w16cex="http://schemas.microsoft.com/office/word/2018/wordml/cex" xmlns:w16cid="http://schemas.microsoft.com/office/word/2016/wordml/cid" xmlns:w16="http://schemas.microsoft.com/office/word/2018/wordml" xmlns:w16du="http://schemas.microsoft.com/office/word/2023/wordml/word16du" xmlns:w16sdtdh="http://schemas.microsoft.com/office/word/2020/wordml/sdtdatahash" xmlns:w16se="http://schemas.microsoft.com/office/word/2015/wordml/symex" xmlns:wpg="http://schemas.microsoft.com/office/word/2010/wordprocessingGroup" xmlns:wpi="http://schemas.microsoft.com/office/word/2010/wordprocessingInk" xmlns:wne="http://schemas.microsoft.com/office/word/2006/wordml" xmlns:wps="http://schemas.microsoft.com/office/word/2010/wordprocessingShape" mc:Ignorable="w14 w15 w16se w16cid w16 w16cex w16sdtdh w16du wp14">
+<w:numbering xmlns:wpc="http://schemas.microsoft.com/office/word/2010/wordprocessingCanvas" xmlns:cx="http://schemas.microsoft.com/office/drawing/2014/chartex" xmlns:cx1="http://schemas.microsoft.com/office/drawing/2015/9/8/chartex" xmlns:cx2="http://schemas.microsoft.com/office/drawing/2015/10/21/chartex" xmlns:cx3="http://schemas.microsoft.com/office/drawing/2016/5/9/chartex" xmlns:cx4="http://schemas.microsoft.com/office/drawing/2016/5/10/chartex" xmlns:cx5="http://schemas.microsoft.com/office/drawing/2016/5/11/chartex" xmlns:cx6="http://schemas.microsoft.com/office/drawing/2016/5/12/chartex" xmlns:cx7="http://schemas.microsoft.com/office/drawing/2016/5/13/chartex" xmlns:cx8="http://schemas.microsoft.com/office/drawing/2016/5/14/chartex" xmlns:mc="http://schemas.openxmlformats.org/markup-compatibility/2006" xmlns:aink="http://schemas.microsoft.com/office/drawing/2016/ink" xmlns:am3d="http://schemas.microsoft.com/office/drawing/2017/model3d" xmlns:o="urn:schemas-microsoft-com:office:office" xmlns:oel="http://schemas.microsoft.com/office/2019/extlst" xmlns:r="http://schemas.openxmlformats.org/officeDocument/2006/relationships" xmlns:m="http://schemas.openxmlformats.org/officeDocument/2006/math" xmlns:v="urn:schemas-microsoft-com:vml" xmlns:wp14="http://schemas.microsoft.com/office/word/2010/wordprocessingDrawing" xmlns:wp="http://schemas.openxmlformats.org/drawingml/2006/wordprocessingDrawing" xmlns:w10="urn:schemas-microsoft-com:office:word" xmlns:w="http://schemas.openxmlformats.org/wordprocessingml/2006/main" xmlns:w14="http://schemas.microsoft.com/office/word/2010/wordml" xmlns:w15="http://schemas.microsoft.com/office/word/2012/wordml" xmlns:w16cex="http://schemas.microsoft.com/office/word/2018/wordml/cex" xmlns:w16cid="http://schemas.microsoft.com/office/word/2016/wordml/cid" xmlns:w16="http://schemas.microsoft.com/office/word/2018/wordml" xmlns:w16du="http://schemas.microsoft.com/office/word/2023/wordml/word16du" xmlns:w16sdtdh="http://schemas.microsoft.com/office/word/2020/wordml/sdtdatahash" xmlns:w16sdtfl="http://schemas.microsoft.com/office/word/2024/wordml/sdtformatlock" xmlns:w16se="http://schemas.microsoft.com/office/word/2015/wordml/symex" xmlns:wpg="http://schemas.microsoft.com/office/word/2010/wordprocessingGroup" xmlns:wpi="http://schemas.microsoft.com/office/word/2010/wordprocessingInk" xmlns:wne="http://schemas.microsoft.com/office/word/2006/wordml" xmlns:wps="http://schemas.microsoft.com/office/word/2010/wordprocessingShape" mc:Ignorable="w14 w15 w16se w16cid w16 w16cex w16sdtdh w16sdtfl w16du wp14">
   <w:abstractNum w:abstractNumId="0" w15:restartNumberingAfterBreak="0">
     <w:nsid w:val="068B202B"/>
     <w:multiLevelType w:val="multilevel"/>
@@ -6125,7 +6432,7 @@
 </file>
 
 <file path=word/styles.xml><?xml version="1.0" encoding="utf-8"?>
-<w:styles xmlns:mc="http://schemas.openxmlformats.org/markup-compatibility/2006" xmlns:r="http://schemas.openxmlformats.org/officeDocument/2006/relationships" xmlns:w="http://schemas.openxmlformats.org/wordprocessingml/2006/main" xmlns:w14="http://schemas.microsoft.com/office/word/2010/wordml" xmlns:w15="http://schemas.microsoft.com/office/word/2012/wordml" xmlns:w16cex="http://schemas.microsoft.com/office/word/2018/wordml/cex" xmlns:w16cid="http://schemas.microsoft.com/office/word/2016/wordml/cid" xmlns:w16="http://schemas.microsoft.com/office/word/2018/wordml" xmlns:w16du="http://schemas.microsoft.com/office/word/2023/wordml/word16du" xmlns:w16sdtdh="http://schemas.microsoft.com/office/word/2020/wordml/sdtdatahash" xmlns:w16se="http://schemas.microsoft.com/office/word/2015/wordml/symex" mc:Ignorable="w14 w15 w16se w16cid w16 w16cex w16sdtdh w16du">
+<w:styles xmlns:mc="http://schemas.openxmlformats.org/markup-compatibility/2006" xmlns:r="http://schemas.openxmlformats.org/officeDocument/2006/relationships" xmlns:w="http://schemas.openxmlformats.org/wordprocessingml/2006/main" xmlns:w14="http://schemas.microsoft.com/office/word/2010/wordml" xmlns:w15="http://schemas.microsoft.com/office/word/2012/wordml" xmlns:w16cex="http://schemas.microsoft.com/office/word/2018/wordml/cex" xmlns:w16cid="http://schemas.microsoft.com/office/word/2016/wordml/cid" xmlns:w16="http://schemas.microsoft.com/office/word/2018/wordml" xmlns:w16du="http://schemas.microsoft.com/office/word/2023/wordml/word16du" xmlns:w16sdtdh="http://schemas.microsoft.com/office/word/2020/wordml/sdtdatahash" xmlns:w16sdtfl="http://schemas.microsoft.com/office/word/2024/wordml/sdtformatlock" xmlns:w16se="http://schemas.microsoft.com/office/word/2015/wordml/symex" mc:Ignorable="w14 w15 w16se w16cid w16 w16cex w16sdtdh w16sdtfl w16du">
   <w:docDefaults>
     <w:rPrDefault>
       <w:rPr>

</xml_diff>